<commit_message>
Storyboard: stations renamed levels, teacher code note (from the group)
Co-Authored-By: Claude Opus 5.5 <noreply@anthropic.com>
</commit_message>
<xml_diff>
--- a/docs/storyboard.docx
+++ b/docs/storyboard.docx
@@ -80,7 +80,7 @@
         <w:t xml:space="preserve">EBS Learning Journey app (V45)</w:t>
       </w:r>
       <w:r>
-        <w:t xml:space="preserve">: a landing page with a route of five stations, step tabs inside each station, Submit then recap, badges, a learning report and a teacher area. Edit it directly. Once your group is happy with it, it goes to Claude Code with the build prompt.</w:t>
+        <w:t xml:space="preserve">: a landing page with a route of five levels, step tabs inside each level, Submit then recap, badges, a learning report and a teacher area. Edit it directly. Once your group is happy with it, it goes to Claude Code with the build prompt.</w:t>
       </w:r>
     </w:p>
     <w:p>
@@ -503,7 +503,7 @@
                 <w:sz w:val="19"/>
                 <w:szCs w:val="19"/>
               </w:rPr>
-              <w:t xml:space="preserve">Kept as "4 key terms" (pre-training before Station 2).</w:t>
+              <w:t xml:space="preserve">Kept as "4 key terms" (pre-training before Level 2).</w:t>
             </w:r>
           </w:p>
         </w:tc>
@@ -553,7 +553,7 @@
                 <w:sz w:val="19"/>
                 <w:szCs w:val="19"/>
               </w:rPr>
-              <w:t xml:space="preserve">Kept, but stations now unlock in order (each opens when the one before is finished), because the flow depends on it. Teacher Mode can unlock all stations on a device.</w:t>
+              <w:t xml:space="preserve">Kept, but levels now unlock in order (each opens when the one before is finished), because the flow depends on it. Teacher Mode can unlock all levels on a device.</w:t>
             </w:r>
           </w:p>
         </w:tc>
@@ -651,7 +651,7 @@
                 <w:sz w:val="19"/>
                 <w:szCs w:val="19"/>
               </w:rPr>
-              <w:t xml:space="preserve">Five new station badges (prompts in Section F). Team badges removed.</w:t>
+              <w:t xml:space="preserve">Five new level badges (prompts in Section F). Team badges removed.</w:t>
             </w:r>
           </w:p>
         </w:tc>
@@ -872,6 +872,55 @@
                 <w:sz w:val="19"/>
                 <w:szCs w:val="19"/>
               </w:rPr>
+              <w:t xml:space="preserve">The five parts are called stations</w:t>
+            </w:r>
+          </w:p>
+        </w:tc>
+        <w:tc>
+          <w:tcPr>
+            <w:tcW w:type="dxa" w:w="5600"/>
+            <w:tcMar>
+              <w:top w:type="dxa" w:w="60"/>
+              <w:left w:type="dxa" w:w="100"/>
+              <w:bottom w:type="dxa" w:w="60"/>
+              <w:right w:type="dxa" w:w="100"/>
+            </w:tcMar>
+          </w:tcPr>
+          <w:p>
+            <w:pPr>
+              <w:spacing w:after="60"/>
+            </w:pPr>
+            <w:r>
+              <w:rPr>
+                <w:sz w:val="19"/>
+                <w:szCs w:val="19"/>
+              </w:rPr>
+              <w:t xml:space="preserve">Called levels (Level 1 to Level 5), because the whole app is already called a module.</w:t>
+            </w:r>
+          </w:p>
+        </w:tc>
+      </w:tr>
+      <w:tr>
+        <w:tc>
+          <w:tcPr>
+            <w:tcW w:type="dxa" w:w="4300"/>
+            <w:shd w:fill="F7F9FC" w:val="clear"/>
+            <w:tcMar>
+              <w:top w:type="dxa" w:w="60"/>
+              <w:left w:type="dxa" w:w="100"/>
+              <w:bottom w:type="dxa" w:w="60"/>
+              <w:right w:type="dxa" w:w="100"/>
+            </w:tcMar>
+          </w:tcPr>
+          <w:p>
+            <w:pPr>
+              <w:spacing w:after="60"/>
+            </w:pPr>
+            <w:r>
+              <w:rPr>
+                <w:sz w:val="19"/>
+                <w:szCs w:val="19"/>
+              </w:rPr>
               <w:t xml:space="preserve">Pinch-to-zoom blocked (maximum-scale=1.0)</w:t>
             </w:r>
           </w:p>
@@ -879,6 +928,7 @@
         <w:tc>
           <w:tcPr>
             <w:tcW w:type="dxa" w:w="5600"/>
+            <w:shd w:fill="F7F9FC" w:val="clear"/>
             <w:tcMar>
               <w:top w:type="dxa" w:w="60"/>
               <w:left w:type="dxa" w:w="100"/>
@@ -1484,7 +1534,7 @@
         <w:spacing w:after="50"/>
       </w:pPr>
       <w:r>
-        <w:t xml:space="preserve">Sticky top bar (title, 🏠 Home) and sticky step tabs inside a station. Locked tabs show 🔒 and cannot be tapped.</w:t>
+        <w:t xml:space="preserve">Sticky top bar (title, 🏠 Home) and sticky step tabs inside a level. Locked tabs show 🔒 and cannot be tapped.</w:t>
       </w:r>
     </w:p>
     <w:p>
@@ -1693,7 +1743,7 @@
                 <w:sz w:val="19"/>
                 <w:szCs w:val="19"/>
               </w:rPr>
-              <w:t xml:space="preserve">The four Nexora comics and the real-life Foodpanda and Uniqlo examples sit inside the notes. New images are added only where they explain an idea; no decorative station banners.</w:t>
+              <w:t xml:space="preserve">The four Nexora comics and the real-life Foodpanda and Uniqlo examples sit inside the notes. New images are added only where they explain an idea; no decorative level banners.</w:t>
             </w:r>
           </w:p>
         </w:tc>
@@ -1889,7 +1939,7 @@
                 <w:sz w:val="19"/>
                 <w:szCs w:val="19"/>
               </w:rPr>
-              <w:t xml:space="preserve">Station 2 is split into three step tabs, and each tab into Continue ↓ parts, so students move at their own pace.</w:t>
+              <w:t xml:space="preserve">Level 2 is split into three step tabs, and each tab into Continue ↓ parts, so students move at their own pace.</w:t>
             </w:r>
           </w:p>
         </w:tc>
@@ -2122,7 +2172,7 @@
           <w:sz w:val="19"/>
           <w:szCs w:val="19"/>
         </w:rPr>
-        <w:t xml:space="preserve">Suggested times (self-study at home): Station 1 about 5 min, Station 2 about 15 min, Station 3 about 10 min, Station 4 about 10 min, Station 5 about 8 min. Total about 45 to 50 min, which can be spread over several sittings.</w:t>
+        <w:t xml:space="preserve">Suggested times (self-study at home): Level 1 about 5 min, Level 2 about 15 min, Level 3 about 10 min, Level 4 about 10 min, Level 5 about 8 min. Total about 45 to 50 min, which can be spread over several sittings.</w:t>
       </w:r>
     </w:p>
     <w:p>
@@ -2480,7 +2530,7 @@
               <w:spacing w:after="30"/>
             </w:pPr>
             <w:r>
-              <w:t xml:space="preserve">Returning student: shows "Welcome back! Your work has been loaded." and opens the home page (0.3) where they left off, with their finished stations, badges and saved answers.</w:t>
+              <w:t xml:space="preserve">Returning student: shows "Welcome back! Your work has been loaded." and opens the home page (0.3) where they left off, with their finished levels, badges and saved answers.</w:t>
             </w:r>
           </w:p>
           <w:p>
@@ -2736,7 +2786,7 @@
                 <w:sz w:val="19"/>
                 <w:szCs w:val="19"/>
               </w:rPr>
-              <w:t xml:space="preserve"> The app saves the student's whole progress to the server under class plus register number: stations finished, current tab and Continue parts opened, badges, all answers (including half-typed ones) and first attempts. It saves on every Continue, Next, Submit and tab change, and every 30 seconds while the student is typing. A copy is also kept on the device as a backup, and changes made offline are sent when the connection returns (the LJ's offline queue).</w:t>
+              <w:t xml:space="preserve"> The app saves the student's whole progress to the server under class plus register number: levels finished, current tab and Continue parts opened, badges, all answers (including half-typed ones) and first attempts. It saves on every Continue, Next, Submit and tab change, and every 30 seconds while the student is typing. A copy is also kept on the device as a backup, and changes made offline are sent when the connection returns (the LJ's offline queue).</w:t>
             </w:r>
           </w:p>
           <w:p>
@@ -2926,7 +2976,7 @@
               <w:ind w:left="240"/>
             </w:pPr>
             <w:r>
-              <w:t xml:space="preserve">1. Go through the stations in order. Each one opens when you finish the one before.</w:t>
+              <w:t xml:space="preserve">1. Go through the levels in order. Each one opens when you finish the one before.</w:t>
             </w:r>
           </w:p>
           <w:p>
@@ -2950,7 +3000,7 @@
               <w:ind w:left="240"/>
             </w:pPr>
             <w:r>
-              <w:t xml:space="preserve">3. Stations 3 and 4 open an AI chatbot in a new tab. Log in with your school Google account if asked, and don't share personal details in the chat.</w:t>
+              <w:t xml:space="preserve">3. Levels 3 and 4 open an AI chatbot in a new tab. Log in with your school Google account if asked, and don't share personal details in the chat.</w:t>
             </w:r>
           </w:p>
           <w:p>
@@ -3283,7 +3333,7 @@
               <w:t xml:space="preserve">📘 Start here: 4 key terms</w:t>
             </w:r>
             <w:r>
-              <w:t xml:space="preserve"> / A 1-minute look before Station 2</w:t>
+              <w:t xml:space="preserve"> / A 1-minute look before Level 2</w:t>
             </w:r>
           </w:p>
           <w:p>
@@ -3298,7 +3348,7 @@
               <w:t xml:space="preserve">Your route</w:t>
             </w:r>
             <w:r>
-              <w:t xml:space="preserve">: "2 of 5 stations done" with a progress bar, then five station cards:</w:t>
+              <w:t xml:space="preserve">: "2 of 5 levels done" with a progress bar, then five level cards:</w:t>
             </w:r>
           </w:p>
           <w:p>
@@ -3439,7 +3489,7 @@
               <w:spacing w:after="60"/>
             </w:pPr>
             <w:r>
-              <w:t xml:space="preserve">After all five stations: button </w:t>
+              <w:t xml:space="preserve">After all five levels: button </w:t>
             </w:r>
             <w:r>
               <w:rPr>
@@ -3502,7 +3552,7 @@
               <w:spacing w:after="40"/>
             </w:pPr>
             <w:r>
-              <w:t xml:space="preserve">Tap an open card to go to that station. Tapping a locked card shows: "Finish Station {n − 1} first to open this station."</w:t>
+              <w:t xml:space="preserve">Tap an open card to go to that level. Tapping a locked card shows: "Finish Level {n − 1} first to open this level."</w:t>
             </w:r>
           </w:p>
           <w:p>
@@ -3568,7 +3618,7 @@
               <w:spacing w:after="40"/>
             </w:pPr>
             <w:r>
-              <w:t xml:space="preserve">0 done: "Welcome! Start with Station 1."</w:t>
+              <w:t xml:space="preserve">0 done: "Welcome! Start with Level 1."</w:t>
             </w:r>
           </w:p>
           <w:p>
@@ -3581,7 +3631,7 @@
               <w:spacing w:after="40"/>
             </w:pPr>
             <w:r>
-              <w:t xml:space="preserve">1 to 4 done: "Welcome back! You've finished {n} of 5 stations. Keep going!"</w:t>
+              <w:t xml:space="preserve">1 to 4 done: "Welcome back! You've finished {n} of 5 levels. Keep going!"</w:t>
             </w:r>
           </w:p>
           <w:p>
@@ -3594,7 +3644,7 @@
               <w:spacing w:after="40"/>
             </w:pPr>
             <w:r>
-              <w:t xml:space="preserve">5 done: "You've finished all 5 stations. Well done! Have a look at your learning report."</w:t>
+              <w:t xml:space="preserve">5 done: "You've finished all 5 levels. Well done! Have a look at your learning report."</w:t>
             </w:r>
           </w:p>
         </w:tc>
@@ -3825,7 +3875,7 @@
               <w:ind w:left="240"/>
             </w:pPr>
             <w:r>
-              <w:t xml:space="preserve">You'll meet these words in Station 2. Read them once now.</w:t>
+              <w:t xml:space="preserve">You'll meet these words in Level 2. Read them once now.</w:t>
             </w:r>
           </w:p>
           <w:p>
@@ -3971,7 +4021,7 @@
                 <w:sz w:val="19"/>
                 <w:szCs w:val="19"/>
               </w:rPr>
-              <w:t xml:space="preserve">Textbook pp. 120, 123 and 140. The same wording is used in Station 2, so students see each definition twice: once as pre-training and once in context.</w:t>
+              <w:t xml:space="preserve">Textbook pp. 120, 123 and 140. The same wording is used in Level 2, so students see each definition twice: once as pre-training and once in context.</w:t>
             </w:r>
           </w:p>
         </w:tc>
@@ -3993,7 +4043,7 @@
         <w:spacing w:after="100" w:before="240"/>
       </w:pPr>
       <w:r>
-        <w:t xml:space="preserve">Station 1: Your Customer Service Stories</w:t>
+        <w:t xml:space="preserve">Level 1: Your Customer Service Stories</w:t>
       </w:r>
     </w:p>
     <w:tbl>
@@ -4085,7 +4135,7 @@
               <w:spacing w:after="60"/>
             </w:pPr>
             <w:r>
-              <w:t xml:space="preserve">Tapping Station 1. Open from the start.</w:t>
+              <w:t xml:space="preserve">Tapping Level 1. Open from the start.</w:t>
             </w:r>
           </w:p>
         </w:tc>
@@ -4133,14 +4183,14 @@
               <w:spacing w:after="60"/>
             </w:pPr>
             <w:r>
-              <w:t xml:space="preserve">Station header: </w:t>
-            </w:r>
-            <w:r>
-              <w:rPr>
-                <w:b/>
-                <w:bCs/>
-              </w:rPr>
-              <w:t xml:space="preserve">📝 Station 1: Your Customer Service Stories</w:t>
+              <w:t xml:space="preserve">Level header: </w:t>
+            </w:r>
+            <w:r>
+              <w:rPr>
+                <w:b/>
+                <w:bCs/>
+              </w:rPr>
+              <w:t xml:space="preserve">📝 Level 1: Your Customer Service Stories</w:t>
             </w:r>
           </w:p>
           <w:p>
@@ -4341,7 +4391,7 @@
               <w:t xml:space="preserve">Remember this</w:t>
             </w:r>
             <w:r>
-              <w:t xml:space="preserve">: Keep your stories in mind. In Station 2, see whether your ideas match what businesses call quality customer service.</w:t>
+              <w:t xml:space="preserve">: Keep your stories in mind. In Level 2, see whether your ideas match what businesses call quality customer service.</w:t>
             </w:r>
           </w:p>
           <w:p>
@@ -4353,7 +4403,7 @@
               <w:ind w:left="240"/>
             </w:pPr>
             <w:r>
-              <w:t xml:space="preserve">[Finish Station 1]</w:t>
+              <w:t xml:space="preserve">[Finish Level 1]</w:t>
             </w:r>
           </w:p>
         </w:tc>
@@ -4412,7 +4462,7 @@
               <w:t xml:space="preserve">[Badge 1] 📝 Story Sharer</w:t>
             </w:r>
             <w:r>
-              <w:t xml:space="preserve"> "You earned the Story Sharer badge!" [Back to my route]. Station 2 unlocks.</w:t>
+              <w:t xml:space="preserve"> "You earned the Story Sharer badge!" [Back to my route]. Level 2 unlocks.</w:t>
             </w:r>
           </w:p>
         </w:tc>
@@ -4531,7 +4581,7 @@
         <w:spacing w:after="100" w:before="240"/>
       </w:pPr>
       <w:r>
-        <w:t xml:space="preserve">Station 2: Learn: Customer Service</w:t>
+        <w:t xml:space="preserve">Level 2: Learn: Customer Service</w:t>
       </w:r>
     </w:p>
     <w:p>
@@ -4546,7 +4596,7 @@
           <w:sz w:val="19"/>
           <w:szCs w:val="19"/>
         </w:rPr>
-        <w:t xml:space="preserve">Three step tabs: 1 Quality Customer Service · 2 The Four Stages · 3 Breakdown and Recovery. Nothing in Station 2 is scored. Tabs unlock in order as each one is read to the end.</w:t>
+        <w:t xml:space="preserve">Three step tabs: 1 Quality Customer Service · 2 The Four Stages · 3 Breakdown and Recovery. Nothing in Level 2 is scored. Tabs unlock in order as each one is read to the end.</w:t>
       </w:r>
     </w:p>
     <w:tbl>
@@ -4638,7 +4688,7 @@
               <w:spacing w:after="60"/>
             </w:pPr>
             <w:r>
-              <w:t xml:space="preserve">Opening Station 2.</w:t>
+              <w:t xml:space="preserve">Opening Level 2.</w:t>
             </w:r>
           </w:p>
         </w:tc>
@@ -6893,7 +6943,7 @@
               <w:ind w:left="240"/>
             </w:pPr>
             <w:r>
-              <w:t xml:space="preserve">[Finish Station 2]</w:t>
+              <w:t xml:space="preserve">[Finish Level 2]</w:t>
             </w:r>
           </w:p>
         </w:tc>
@@ -7010,7 +7060,7 @@
               <w:t xml:space="preserve">[Badge 2] 📘 Service Scholar</w:t>
             </w:r>
             <w:r>
-              <w:t xml:space="preserve">. Station 3 unlocks.</w:t>
+              <w:t xml:space="preserve">. Level 3 unlocks.</w:t>
             </w:r>
           </w:p>
         </w:tc>
@@ -7176,7 +7226,7 @@
         <w:spacing w:after="100" w:before="240"/>
       </w:pPr>
       <w:r>
-        <w:t xml:space="preserve">Station 3: Chat with Alex</w:t>
+        <w:t xml:space="preserve">Level 3: Chat with Alex</w:t>
       </w:r>
     </w:p>
     <w:p>
@@ -7283,7 +7333,7 @@
               <w:spacing w:after="60"/>
             </w:pPr>
             <w:r>
-              <w:t xml:space="preserve">Opening Station 3 (unlocked after Station 2).</w:t>
+              <w:t xml:space="preserve">Opening Level 3 (unlocked after Level 2).</w:t>
             </w:r>
           </w:p>
         </w:tc>
@@ -8127,7 +8177,7 @@
               <w:t xml:space="preserve">[Badge 3] 🔍 Service Spotter</w:t>
             </w:r>
             <w:r>
-              <w:t xml:space="preserve">. Station 4 unlocks.</w:t>
+              <w:t xml:space="preserve">. Level 4 unlocks.</w:t>
             </w:r>
           </w:p>
         </w:tc>
@@ -8198,7 +8248,7 @@
         <w:spacing w:after="100" w:before="240"/>
       </w:pPr>
       <w:r>
-        <w:t xml:space="preserve">Station 4: Serve Suzzie at Stylez</w:t>
+        <w:t xml:space="preserve">Level 4: Serve Suzzie at Stylez</w:t>
       </w:r>
     </w:p>
     <w:p>
@@ -8305,7 +8355,7 @@
               <w:spacing w:after="60"/>
             </w:pPr>
             <w:r>
-              <w:t xml:space="preserve">Opening Station 4 (unlocked after Station 3).</w:t>
+              <w:t xml:space="preserve">Opening Level 4 (unlocked after Level 3).</w:t>
             </w:r>
           </w:p>
         </w:tc>
@@ -8425,7 +8475,7 @@
               <w:ind w:left="240"/>
             </w:pPr>
             <w:r>
-              <w:t xml:space="preserve">Try to use the four stages from Station 2: approach Suzzie, present product information, close positively, and if there's a problem, perform service recovery.</w:t>
+              <w:t xml:space="preserve">Try to use the four stages from Level 2: approach Suzzie, present product information, close positively, and if there's a problem, perform service recovery.</w:t>
             </w:r>
           </w:p>
           <w:p>
@@ -8576,7 +8626,7 @@
                 <w:sz w:val="19"/>
                 <w:szCs w:val="19"/>
               </w:rPr>
-              <w:t xml:space="preserve">"Station 2" replaces v7's "Section 1", because the app has no section numbers. The opening line was suggested in the 1 October walkthrough; delete it if Suzzie's Gem already starts the chat.</w:t>
+              <w:t xml:space="preserve">"Level 2" replaces v7's "Section 1", because the app has no section numbers. The opening line was suggested in the 1 October walkthrough; delete it if Suzzie's Gem already starts the chat.</w:t>
             </w:r>
           </w:p>
         </w:tc>
@@ -8847,7 +8897,7 @@
               <w:t xml:space="preserve">[Badge 4] ⭐ Service Star</w:t>
             </w:r>
             <w:r>
-              <w:t xml:space="preserve">. Station 5 unlocks.</w:t>
+              <w:t xml:space="preserve">. Level 5 unlocks.</w:t>
             </w:r>
           </w:p>
         </w:tc>
@@ -8869,7 +8919,7 @@
         <w:spacing w:after="100" w:before="240"/>
       </w:pPr>
       <w:r>
-        <w:t xml:space="preserve">Station 5: Check and Exit Ticket</w:t>
+        <w:t xml:space="preserve">Level 5: Check and Exit Ticket</w:t>
       </w:r>
     </w:p>
     <w:p>
@@ -8976,7 +9026,7 @@
               <w:spacing w:after="60"/>
             </w:pPr>
             <w:r>
-              <w:t xml:space="preserve">Opening Station 5 (unlocked after Station 4).</w:t>
+              <w:t xml:space="preserve">Opening Level 5 (unlocked after Level 4).</w:t>
             </w:r>
           </w:p>
         </w:tc>
@@ -9293,7 +9343,7 @@
               <w:spacing w:after="40"/>
             </w:pPr>
             <w:r>
-              <w:t xml:space="preserve">iv wrong (False): "Look at the definition of service breakdown in Station 2. When does a service breakdown occur?"</w:t>
+              <w:t xml:space="preserve">iv wrong (False): "Look at the definition of service breakdown in Level 2. When does a service breakdown occur?"</w:t>
             </w:r>
           </w:p>
           <w:p>
@@ -9503,7 +9553,7 @@
                 <w:sz w:val="19"/>
                 <w:szCs w:val="19"/>
               </w:rPr>
-              <w:t xml:space="preserve">Statement iv uses the textbook definition, matching Station 2.</w:t>
+              <w:t xml:space="preserve">Statement iv uses the textbook definition, matching Level 2.</w:t>
             </w:r>
           </w:p>
           <w:p>
@@ -9661,7 +9711,7 @@
               <w:spacing w:after="60"/>
             </w:pPr>
             <w:r>
-              <w:t xml:space="preserve">Four rows, each with a row of four faces (as in the LJ's Station 5 rating row), labels underneath: 😟 Not yet / 🙁 A little / 🙂 Confident / 😄 Very confident.</w:t>
+              <w:t xml:space="preserve">Four rows, each with a row of four faces (as in the LJ's Level 5 rating row), labels underneath: 😟 Not yet / 🙁 A little / 🙂 Confident / 😄 Very confident.</w:t>
             </w:r>
           </w:p>
           <w:p>
@@ -9991,7 +10041,7 @@
               <w:spacing w:after="60"/>
             </w:pPr>
             <w:r>
-              <w:t xml:space="preserve">"My learning report" on the home page (after all 5 stations), or from the Station 5 pop-up.</w:t>
+              <w:t xml:space="preserve">"My learning report" on the home page (after all 5 levels), or from the Level 5 pop-up.</w:t>
             </w:r>
           </w:p>
         </w:tc>
@@ -10059,7 +10109,7 @@
               <w:spacing w:after="40"/>
             </w:pPr>
             <w:r>
-              <w:t xml:space="preserve">One row per station: ✅ and the date finished, plus the badge.</w:t>
+              <w:t xml:space="preserve">One row per level: ✅ and the date finished, plus the badge.</w:t>
             </w:r>
           </w:p>
           <w:p>
@@ -10072,7 +10122,7 @@
               <w:spacing w:after="40"/>
             </w:pPr>
             <w:r>
-              <w:t xml:space="preserve">Station 3, Q2: first try {x} / 4. Station 5, Q3 and Q4: first try {y} / 5.</w:t>
+              <w:t xml:space="preserve">Level 3, Q2: first try {x} / 4. Level 5, Q3 and Q4: first try {y} / 5.</w:t>
             </w:r>
           </w:p>
           <w:p>
@@ -10092,7 +10142,7 @@
               <w:t xml:space="preserve">Look at these again:</w:t>
             </w:r>
             <w:r>
-              <w:t xml:space="preserve"> one line per item wrong on the first try, naming the topic and where to find it, e.g. "Closing the customer experience positively (Station 2, The Four Stages)".</w:t>
+              <w:t xml:space="preserve"> one line per item wrong on the first try, naming the topic and where to find it, e.g. "Closing the customer experience positively (Level 2, The Four Stages)".</w:t>
             </w:r>
           </w:p>
           <w:p>
@@ -10409,7 +10459,7 @@
                 <w:sz w:val="19"/>
                 <w:szCs w:val="19"/>
               </w:rPr>
-              <w:t xml:space="preserve">The teacher code is checked on the server and never written in app.js (as in the LJ). Use a new code for this app, stored in the Apps Script project's settings (Script Properties), never in the code.</w:t>
+              <w:t xml:space="preserve">The teacher code is checked on the server and never written in app.js or anywhere in the repo (as in the LJ). It is not case sensitive: the script compares it after trimming spaces and ignoring capitals. The group has chosen the code; it is not written in this storyboard because the repo is public. Use a new code for this app, stored in the Apps Script project's settings (Script Properties), never in the code.</w:t>
             </w:r>
           </w:p>
         </w:tc>
@@ -10772,7 +10822,7 @@
               <w:t xml:space="preserve">Class summary</w:t>
             </w:r>
             <w:r>
-              <w:t xml:space="preserve">: how many students finished each station; the most-missed Q2 and Q3/Q4 items (first try); the confidence spread for each of the four exit-ticket rows; and a list of all Q7 answers ("one question I still have") for planning reteaching.</w:t>
+              <w:t xml:space="preserve">: how many students finished each level; the most-missed Q2 and Q3/Q4 items (first try); the confidence spread for each of the four exit-ticket rows; and a list of all Q7 answers ("one question I still have") for planning reteaching.</w:t>
             </w:r>
           </w:p>
           <w:p>
@@ -10792,7 +10842,7 @@
               <w:t xml:space="preserve">Students table</w:t>
             </w:r>
             <w:r>
-              <w:t xml:space="preserve">: Register No. | Stations done | Q2 first try | Q3 and Q4 first try | Confidence (four faces). Tap a row to open the student's full report: Station 1 stories, Station 2 optional answers, Q1, Q2 (first and second try), Station 4 reflections, Q3 to Q5, and the exit ticket.</w:t>
+              <w:t xml:space="preserve">: Register No. | Levels done | Q2 first try | Q3 and Q4 first try | Confidence (four faces). Tap a row to open the student's full report: Level 1 stories, Level 2 optional answers, Q1, Q2 (first and second try), Level 4 reflections, Q3 to Q5, and the exit ticket.</w:t>
             </w:r>
           </w:p>
           <w:p>
@@ -10818,7 +10868,7 @@
               <w:spacing w:after="40"/>
             </w:pPr>
             <w:r>
-              <w:t xml:space="preserve">In a student's full report: [Clear this student's work]. Pop-up: "Clear all work for Class {class}, Register No. {n}? This deletes their answers, first attempts, badges and progress, and cannot be undone. Download the CSV first if you want a copy." [Clear work] [Cancel]. Afterwards: "Work cleared. This student starts again from Station 1 the next time they log in."</w:t>
+              <w:t xml:space="preserve">In a student's full report: [Clear this student's work]. Pop-up: "Clear all work for Class {class}, Register No. {n}? This deletes their answers, first attempts, badges and progress, and cannot be undone. Download the CSV first if you want a copy." [Clear work] [Cancel]. Afterwards: "Work cleared. This student starts again from Level 1 the next time they log in."</w:t>
             </w:r>
           </w:p>
         </w:tc>
@@ -10990,7 +11040,7 @@
               <w:spacing w:after="40"/>
             </w:pPr>
             <w:r>
-              <w:t xml:space="preserve">[Unlock all stations on this device]: for demos and for students who need to skip ahead. Shows "All stations are unlocked on this device." and can be turned off.</w:t>
+              <w:t xml:space="preserve">[Unlock all levels on this device]: for demos and for students who need to skip ahead. Shows "All levels are unlocked on this device." and can be turned off.</w:t>
             </w:r>
           </w:p>
           <w:p>
@@ -11197,7 +11247,7 @@
                 <w:sz w:val="19"/>
                 <w:szCs w:val="19"/>
               </w:rPr>
-              <w:t xml:space="preserve">Station 2, Tab 1, part 1</w:t>
+              <w:t xml:space="preserve">Level 2, Tab 1, part 1</w:t>
             </w:r>
           </w:p>
         </w:tc>
@@ -11271,7 +11321,7 @@
                 <w:sz w:val="19"/>
                 <w:szCs w:val="19"/>
               </w:rPr>
-              <w:t xml:space="preserve">Station 2, Tab 2, part 1</w:t>
+              <w:t xml:space="preserve">Level 2, Tab 2, part 1</w:t>
             </w:r>
           </w:p>
         </w:tc>
@@ -11342,7 +11392,7 @@
                 <w:sz w:val="19"/>
                 <w:szCs w:val="19"/>
               </w:rPr>
-              <w:t xml:space="preserve">Station 2, Tab 2, part 2</w:t>
+              <w:t xml:space="preserve">Level 2, Tab 2, part 2</w:t>
             </w:r>
           </w:p>
         </w:tc>
@@ -11416,7 +11466,7 @@
                 <w:sz w:val="19"/>
                 <w:szCs w:val="19"/>
               </w:rPr>
-              <w:t xml:space="preserve">Station 2, Tab 3, part 1</w:t>
+              <w:t xml:space="preserve">Level 2, Tab 3, part 1</w:t>
             </w:r>
           </w:p>
         </w:tc>
@@ -11487,7 +11537,7 @@
                 <w:sz w:val="19"/>
                 <w:szCs w:val="19"/>
               </w:rPr>
-              <w:t xml:space="preserve">Station 2, Tab 3, part 2 (side by side; stacked on phones)</w:t>
+              <w:t xml:space="preserve">Level 2, Tab 3, part 2 (side by side; stacked on phones)</w:t>
             </w:r>
           </w:p>
         </w:tc>
@@ -11561,7 +11611,7 @@
                 <w:sz w:val="19"/>
                 <w:szCs w:val="19"/>
               </w:rPr>
-              <w:t xml:space="preserve">Station 2, Tab 3, part 3</w:t>
+              <w:t xml:space="preserve">Level 2, Tab 3, part 3</w:t>
             </w:r>
           </w:p>
         </w:tc>
@@ -12512,7 +12562,7 @@
                 <w:sz w:val="24"/>
                 <w:szCs w:val="24"/>
               </w:rPr>
-              <w:t xml:space="preserve">Badge 1  📝 Story Sharer (Station 1)</w:t>
+              <w:t xml:space="preserve">Badge 1  📝 Story Sharer (Level 1)</w:t>
             </w:r>
           </w:p>
         </w:tc>
@@ -12660,7 +12710,7 @@
                 <w:sz w:val="24"/>
                 <w:szCs w:val="24"/>
               </w:rPr>
-              <w:t xml:space="preserve">Badge 2  📘 Service Scholar (Station 2)</w:t>
+              <w:t xml:space="preserve">Badge 2  📘 Service Scholar (Level 2)</w:t>
             </w:r>
           </w:p>
         </w:tc>
@@ -12808,7 +12858,7 @@
                 <w:sz w:val="24"/>
                 <w:szCs w:val="24"/>
               </w:rPr>
-              <w:t xml:space="preserve">Badge 3  🔍 Service Spotter (Station 3)</w:t>
+              <w:t xml:space="preserve">Badge 3  🔍 Service Spotter (Level 3)</w:t>
             </w:r>
           </w:p>
         </w:tc>
@@ -12956,7 +13006,7 @@
                 <w:sz w:val="24"/>
                 <w:szCs w:val="24"/>
               </w:rPr>
-              <w:t xml:space="preserve">Badge 4  ⭐ Service Star (Station 4)</w:t>
+              <w:t xml:space="preserve">Badge 4  ⭐ Service Star (Level 4)</w:t>
             </w:r>
           </w:p>
         </w:tc>
@@ -13104,7 +13154,7 @@
                 <w:sz w:val="24"/>
                 <w:szCs w:val="24"/>
               </w:rPr>
-              <w:t xml:space="preserve">Badge 5  🏆 Chapter 6 Champion (Station 5)</w:t>
+              <w:t xml:space="preserve">Badge 5  🏆 Chapter 6 Champion (Level 5)</w:t>
             </w:r>
           </w:p>
         </w:tc>
@@ -13259,7 +13309,7 @@
         <w:spacing w:after="50"/>
       </w:pPr>
       <w:r>
-        <w:t xml:space="preserve">Order matters in this module (stories before notes, notes before Alex, Alex before Suzzie), so stations unlock in order; a strong student can't skip straight to the quiz. Teacher Mode can unlock everything.</w:t>
+        <w:t xml:space="preserve">Order matters in this module (stories before notes, notes before Alex, Alex before Suzzie), so levels unlock in order; a strong student can't skip straight to the quiz. Teacher Mode can unlock everything.</w:t>
       </w:r>
     </w:p>
     <w:p>
@@ -13311,7 +13361,7 @@
         <w:spacing w:after="50"/>
       </w:pPr>
       <w:r>
-        <w:t xml:space="preserve">v7 referred to "Section 1", which doesn't exist in the app; it now says "Station 2".</w:t>
+        <w:t xml:space="preserve">v7 referred to "Section 1", which doesn't exist in the app; it now says "Level 2".</w:t>
       </w:r>
     </w:p>
     <w:p>
@@ -13324,7 +13374,7 @@
         <w:spacing w:after="50"/>
       </w:pPr>
       <w:r>
-        <w:t xml:space="preserve">Students who tick "I have finished" without chatting can still answer Station 3 from the notes; this is accepted, because the app cannot check, and the teacher can see Q1 answers that don't refer to the chat.</w:t>
+        <w:t xml:space="preserve">Students who tick "I have finished" without chatting can still answer Level 3 from the notes; this is accepted, because the app cannot check, and the teacher can see Q1 answers that don't refer to the chat.</w:t>
       </w:r>
     </w:p>
     <w:p>
@@ -13383,7 +13433,7 @@
         <w:spacing w:after="100"/>
       </w:pPr>
       <w:r>
-        <w:t xml:space="preserve">Once your group has edited and approved this storyboard, I'll write the Claude Code build prompt and a CLAUDE.md with the house rules. The prompt will tell Claude Code to fork V45 (keeping its shell), strip all LJ content and student data, build one station first for review, and then the rest.</w:t>
+        <w:t xml:space="preserve">Once your group has edited and approved this storyboard, I'll write the Claude Code build prompt and a CLAUDE.md with the house rules. The prompt will tell Claude Code to fork V45 (keeping its shell), strip all LJ content and student data, build one level first for review, and then the rest.</w:t>
       </w:r>
     </w:p>
     <w:sectPr>

</xml_diff>

<commit_message>
Five fixes from student simulations (0.12.0)
- How to get your chat link: three numbered steps, one shared component in Levels 4 to 6
- One rule for typed answers: at least one full sentence (20 characters) in every
  sentence box; Skill or quality and link boxes exempt; submitted work not re-checked
- Self-check prompts start "Self-check:" in a neutral style (no tick, cross or red)
- Look at these again: Q, R and S point to where each stage is taught
- Not finished yet pop-ups list everything at once with on-screen Q labels;
  Levels 1, 5 and 6 questions labelled Q1 to Q3, also in the reports
- Tests: new v012-fixes spec at Chromebook, iPad, laptop and phone sizes; older
  tests updated for the group's 0.11.1 to 0.11.9 changes
- Storyboard 0.12.0 from Dan; progress.md

Co-Authored-By: Claude Opus 5.5 <noreply@anthropic.com>
</commit_message>
<xml_diff>
--- a/docs/storyboard.docx
+++ b/docs/storyboard.docx
@@ -43,7 +43,7 @@
           <w:sz w:val="20"/>
           <w:szCs w:val="20"/>
         </w:rPr>
-        <w:t xml:space="preserve">Screen-by-screen storyboard (version 0.11.0, 28 October 2026)</w:t>
+        <w:t xml:space="preserve">Screen-by-screen storyboard (version 0.12.0, 29 October 2026)</w:t>
       </w:r>
     </w:p>
     <w:p>
@@ -78,7 +78,7 @@
           <w:sz w:val="20"/>
           <w:szCs w:val="20"/>
         </w:rPr>
-        <w:t xml:space="preserve">as it will be in version 0.11.0 (28 October 2026)</w:t>
+        <w:t xml:space="preserve">as it will be in version 0.12.0 (29 October 2026)</w:t>
       </w:r>
       <w:r>
         <w:rPr>
@@ -86,7 +86,7 @@
           <w:sz w:val="20"/>
           <w:szCs w:val="20"/>
         </w:rPr>
-        <w:t xml:space="preserve">: the live version 0.10.0 plus three new Nexora comics, the old Level 2 split into two levels (Learn: Customer Service, Part 1 and Part 2), and a new level, Win Suzzie Back, before the Check and Exit Ticket. There are now 7 levels. It replaces the 20 October storyboard, which fell behind while the group made changes during the build. From now on it is again the single source of truth: change it first, then send the change to Claude Code. The build log with every change and its date is docs/progress.md in the repository.</w:t>
+        <w:t xml:space="preserve">: the live version 0.11.9 (checked against the live site on 29 October, including the group's changes after 0.11.0: stage banners, illustrated level icons, orange key words, the Service Saver badge and redrawn C06 and C07) plus five fixes from three student simulations run on 29 October. It replaces the 28 October (0.11.0) storyboard. From now on it is again the single source of truth: change it first, then send the change to Claude Code. The build log with every change and its date is docs/progress.md in the repository.</w:t>
       </w:r>
     </w:p>
     <w:p>
@@ -176,7 +176,43 @@
           <w:sz w:val="20"/>
           <w:szCs w:val="20"/>
         </w:rPr>
-        <w:t xml:space="preserve"> inside them is bold on screen too: in Levels 2 and 3, the key words of each textbook line are bold so weaker readers can see what matters first.</w:t>
+        <w:t xml:space="preserve"> inside them is bold on screen too: in Levels 2 and 3, the key words of each textbook line are bold and orange (#A84B08) so weaker readers can see what matters first.</w:t>
+      </w:r>
+    </w:p>
+    <w:p>
+      <w:pPr>
+        <w:pStyle w:val="ListParagraph"/>
+        <w:numPr>
+          <w:ilvl w:val="0"/>
+          <w:numId w:val="2"/>
+        </w:numPr>
+        <w:spacing w:after="60"/>
+      </w:pPr>
+      <w:r>
+        <w:rPr>
+          <w:color w:val="1F2937"/>
+          <w:sz w:val="20"/>
+          <w:szCs w:val="20"/>
+        </w:rPr>
+        <w:t xml:space="preserve">Text starting with </w:t>
+      </w:r>
+      <w:r>
+        <w:rPr>
+          <w:b/>
+          <w:bCs/>
+          <w:color w:val="1F2937"/>
+          <w:sz w:val="20"/>
+          <w:szCs w:val="20"/>
+        </w:rPr>
+        <w:t xml:space="preserve">🆕 0.12.0</w:t>
+      </w:r>
+      <w:r>
+        <w:rPr>
+          <w:color w:val="1F2937"/>
+          <w:sz w:val="20"/>
+          <w:szCs w:val="20"/>
+        </w:rPr>
+        <w:t xml:space="preserve"> is new or changed in version 0.12.0 and is not on the live site yet. Section H lists the five fixes.</w:t>
       </w:r>
     </w:p>
     <w:p>
@@ -841,7 +877,7 @@
                 <w:sz w:val="19"/>
                 <w:szCs w:val="19"/>
               </w:rPr>
-              <w:t xml:space="preserve">Seven level badges (Level 3's to come). Team badges removed.</w:t>
+              <w:t xml:space="preserve">Seven level badges. Team badges removed.</w:t>
             </w:r>
           </w:p>
         </w:tc>
@@ -1428,7 +1464,7 @@
                 <w:sz w:val="19"/>
                 <w:szCs w:val="19"/>
               </w:rPr>
-              <w:t xml:space="preserve">Brand dark (headings, hover, bold key words)</w:t>
+              <w:t xml:space="preserve">Brand dark (headings, hover)</w:t>
             </w:r>
           </w:p>
         </w:tc>
@@ -1502,7 +1538,7 @@
                 <w:sz w:val="19"/>
                 <w:szCs w:val="19"/>
               </w:rPr>
-              <w:t xml:space="preserve">Brand light (small accents: chips, selected states)</w:t>
+              <w:t xml:space="preserve">Key words (bold phrases inside textbook lines, key-term definitions, recovery path)</w:t>
             </w:r>
           </w:p>
         </w:tc>
@@ -1529,7 +1565,7 @@
                 <w:sz w:val="19"/>
                 <w:szCs w:val="19"/>
               </w:rPr>
-              <w:t xml:space="preserve">#F9ECEF</w:t>
+              <w:t xml:space="preserve">Dark orange #A84B08</w:t>
             </w:r>
           </w:p>
         </w:tc>
@@ -1556,7 +1592,7 @@
                 <w:sz w:val="19"/>
                 <w:szCs w:val="19"/>
               </w:rPr>
-              <w:t xml:space="preserve">Cards are white with a thin #E8DADF border, so they never look like the pink wrong-answer box</w:t>
+              <w:t xml:space="preserve">Darkened from #B45309 in 0.11.9 so it keeps 4.5:1 contrast on the purple recovery cards. Term names, headings and labels keep their own colours.</w:t>
             </w:r>
           </w:p>
         </w:tc>
@@ -1585,7 +1621,7 @@
                 <w:sz w:val="19"/>
                 <w:szCs w:val="19"/>
               </w:rPr>
-              <w:t xml:space="preserve">Page background</w:t>
+              <w:t xml:space="preserve">Brand light (small accents: chips, selected states)</w:t>
             </w:r>
           </w:p>
         </w:tc>
@@ -1612,7 +1648,7 @@
                 <w:sz w:val="19"/>
                 <w:szCs w:val="19"/>
               </w:rPr>
-              <w:t xml:space="preserve">#FAF7F5 (warm off-white)</w:t>
+              <w:t xml:space="preserve">#F9ECEF</w:t>
             </w:r>
           </w:p>
         </w:tc>
@@ -1639,7 +1675,7 @@
                 <w:sz w:val="19"/>
                 <w:szCs w:val="19"/>
               </w:rPr>
-              <w:t xml:space="preserve">Text #1F2937 on it is 13.8:1</w:t>
+              <w:t xml:space="preserve">Cards are white with a thin #E8DADF border, so they never look like the pink wrong-answer box</w:t>
             </w:r>
           </w:p>
         </w:tc>
@@ -1668,7 +1704,7 @@
                 <w:sz w:val="19"/>
                 <w:szCs w:val="19"/>
               </w:rPr>
-              <w:t xml:space="preserve">Right and wrong feedback</w:t>
+              <w:t xml:space="preserve">Page background</w:t>
             </w:r>
           </w:p>
         </w:tc>
@@ -1695,7 +1731,7 @@
                 <w:sz w:val="19"/>
                 <w:szCs w:val="19"/>
               </w:rPr>
-              <w:t xml:space="preserve">Green #15803D on #EAFBEF; red #B91C1C on #FDECEC</w:t>
+              <w:t xml:space="preserve">#FAF7F5 (warm off-white)</w:t>
             </w:r>
           </w:p>
         </w:tc>
@@ -1722,7 +1758,7 @@
                 <w:sz w:val="19"/>
                 <w:szCs w:val="19"/>
               </w:rPr>
-              <w:t xml:space="preserve">Every feedback box also has ✓ or ✗ and a coloured left border, so meaning never rests on colour</w:t>
+              <w:t xml:space="preserve">Text #1F2937 on it is 13.8:1</w:t>
             </w:r>
           </w:p>
         </w:tc>
@@ -1751,7 +1787,7 @@
                 <w:sz w:val="19"/>
                 <w:szCs w:val="19"/>
               </w:rPr>
-              <w:t xml:space="preserve">The four stages</w:t>
+              <w:t xml:space="preserve">Right and wrong feedback</w:t>
             </w:r>
           </w:p>
         </w:tc>
@@ -1778,7 +1814,7 @@
                 <w:sz w:val="19"/>
                 <w:szCs w:val="19"/>
               </w:rPr>
-              <w:t xml:space="preserve">Blue #2563EB, orange #EA580C, green #16A34A, purple #7C3AED</w:t>
+              <w:t xml:space="preserve">Green #15803D on #EAFBEF; red #B91C1C on #FDECEC</w:t>
             </w:r>
           </w:p>
         </w:tc>
@@ -1805,7 +1841,256 @@
                 <w:sz w:val="19"/>
                 <w:szCs w:val="19"/>
               </w:rPr>
-              <w:t xml:space="preserve">Stage table, Stage 1 to 4 labels, four-stages comic and Service Recovery Path. In the Level 4 Q2 dropdown each stage name is shown in its colour; this matches the notes but does not show which line belongs to which stage.</w:t>
+              <w:t xml:space="preserve">Every feedback box also has ✓ or ✗ and a coloured left border, so meaning never rests on colour</w:t>
+            </w:r>
+          </w:p>
+        </w:tc>
+      </w:tr>
+      <w:tr>
+        <w:tc>
+          <w:tcPr>
+            <w:tcW w:type="dxa" w:w="2970"/>
+            <w:tcBorders>
+              <w:top w:val="single" w:color="E8DADF" w:sz="4"/>
+              <w:left w:val="single" w:color="E8DADF" w:sz="4"/>
+              <w:bottom w:val="single" w:color="E8DADF" w:sz="4"/>
+              <w:right w:val="single" w:color="E8DADF" w:sz="4"/>
+            </w:tcBorders>
+            <w:tcMar>
+              <w:top w:type="dxa" w:w="80"/>
+              <w:left w:type="dxa" w:w="120"/>
+              <w:bottom w:type="dxa" w:w="80"/>
+              <w:right w:type="dxa" w:w="120"/>
+            </w:tcMar>
+          </w:tcPr>
+          <w:p>
+            <w:r>
+              <w:rPr>
+                <w:color w:val="1F2937"/>
+                <w:sz w:val="19"/>
+                <w:szCs w:val="19"/>
+              </w:rPr>
+              <w:t xml:space="preserve">🆕 0.12.0: Self-check prompts</w:t>
+            </w:r>
+          </w:p>
+        </w:tc>
+        <w:tc>
+          <w:tcPr>
+            <w:tcW w:type="dxa" w:w="2475"/>
+            <w:tcBorders>
+              <w:top w:val="single" w:color="E8DADF" w:sz="4"/>
+              <w:left w:val="single" w:color="E8DADF" w:sz="4"/>
+              <w:bottom w:val="single" w:color="E8DADF" w:sz="4"/>
+              <w:right w:val="single" w:color="E8DADF" w:sz="4"/>
+            </w:tcBorders>
+            <w:tcMar>
+              <w:top w:type="dxa" w:w="80"/>
+              <w:left w:type="dxa" w:w="120"/>
+              <w:bottom w:type="dxa" w:w="80"/>
+              <w:right w:type="dxa" w:w="120"/>
+            </w:tcMar>
+          </w:tcPr>
+          <w:p>
+            <w:r>
+              <w:rPr>
+                <w:color w:val="1F2937"/>
+                <w:sz w:val="19"/>
+                <w:szCs w:val="19"/>
+              </w:rPr>
+              <w:t xml:space="preserve">White or very light neutral background, thin border, 🔎 icon</w:t>
+            </w:r>
+          </w:p>
+        </w:tc>
+        <w:tc>
+          <w:tcPr>
+            <w:tcW w:type="dxa" w:w="4455"/>
+            <w:tcBorders>
+              <w:top w:val="single" w:color="E8DADF" w:sz="4"/>
+              <w:left w:val="single" w:color="E8DADF" w:sz="4"/>
+              <w:bottom w:val="single" w:color="E8DADF" w:sz="4"/>
+              <w:right w:val="single" w:color="E8DADF" w:sz="4"/>
+            </w:tcBorders>
+            <w:tcMar>
+              <w:top w:type="dxa" w:w="80"/>
+              <w:left w:type="dxa" w:w="120"/>
+              <w:bottom w:type="dxa" w:w="80"/>
+              <w:right w:type="dxa" w:w="120"/>
+            </w:tcMar>
+          </w:tcPr>
+          <w:p>
+            <w:r>
+              <w:rPr>
+                <w:color w:val="1F2937"/>
+                <w:sz w:val="19"/>
+                <w:szCs w:val="19"/>
+              </w:rPr>
+              <w:t xml:space="preserve">No ✓ or ✗ and no red or pink, so a self-check never looks like a wrong answer (Level 4 Q1 and Level 7 Q3)</w:t>
+            </w:r>
+          </w:p>
+        </w:tc>
+      </w:tr>
+      <w:tr>
+        <w:tc>
+          <w:tcPr>
+            <w:tcW w:type="dxa" w:w="2970"/>
+            <w:tcBorders>
+              <w:top w:val="single" w:color="E8DADF" w:sz="4"/>
+              <w:left w:val="single" w:color="E8DADF" w:sz="4"/>
+              <w:bottom w:val="single" w:color="E8DADF" w:sz="4"/>
+              <w:right w:val="single" w:color="E8DADF" w:sz="4"/>
+            </w:tcBorders>
+            <w:tcMar>
+              <w:top w:type="dxa" w:w="80"/>
+              <w:left w:type="dxa" w:w="120"/>
+              <w:bottom w:type="dxa" w:w="80"/>
+              <w:right w:type="dxa" w:w="120"/>
+            </w:tcMar>
+          </w:tcPr>
+          <w:p>
+            <w:r>
+              <w:rPr>
+                <w:color w:val="1F2937"/>
+                <w:sz w:val="19"/>
+                <w:szCs w:val="19"/>
+              </w:rPr>
+              <w:t xml:space="preserve">Quick-check speech boxes (objection quick check)</w:t>
+            </w:r>
+          </w:p>
+        </w:tc>
+        <w:tc>
+          <w:tcPr>
+            <w:tcW w:type="dxa" w:w="2475"/>
+            <w:tcBorders>
+              <w:top w:val="single" w:color="E8DADF" w:sz="4"/>
+              <w:left w:val="single" w:color="E8DADF" w:sz="4"/>
+              <w:bottom w:val="single" w:color="E8DADF" w:sz="4"/>
+              <w:right w:val="single" w:color="E8DADF" w:sz="4"/>
+            </w:tcBorders>
+            <w:tcMar>
+              <w:top w:type="dxa" w:w="80"/>
+              <w:left w:type="dxa" w:w="120"/>
+              <w:bottom w:type="dxa" w:w="80"/>
+              <w:right w:type="dxa" w:w="120"/>
+            </w:tcMar>
+          </w:tcPr>
+          <w:p>
+            <w:r>
+              <w:rPr>
+                <w:color w:val="1F2937"/>
+                <w:sz w:val="19"/>
+                <w:szCs w:val="19"/>
+              </w:rPr>
+              <w:t xml:space="preserve">Customer light purple #F1EAFF; staff pale blue #EAF2FF</w:t>
+            </w:r>
+          </w:p>
+        </w:tc>
+        <w:tc>
+          <w:tcPr>
+            <w:tcW w:type="dxa" w:w="4455"/>
+            <w:tcBorders>
+              <w:top w:val="single" w:color="E8DADF" w:sz="4"/>
+              <w:left w:val="single" w:color="E8DADF" w:sz="4"/>
+              <w:bottom w:val="single" w:color="E8DADF" w:sz="4"/>
+              <w:right w:val="single" w:color="E8DADF" w:sz="4"/>
+            </w:tcBorders>
+            <w:tcMar>
+              <w:top w:type="dxa" w:w="80"/>
+              <w:left w:type="dxa" w:w="120"/>
+              <w:bottom w:type="dxa" w:w="80"/>
+              <w:right w:type="dxa" w:w="120"/>
+            </w:tcMar>
+          </w:tcPr>
+          <w:p>
+            <w:r>
+              <w:rPr>
+                <w:color w:val="1F2937"/>
+                <w:sz w:val="19"/>
+                <w:szCs w:val="19"/>
+              </w:rPr>
+              <w:t xml:space="preserve">Each line keeps its Customer or Staff label</w:t>
+            </w:r>
+          </w:p>
+        </w:tc>
+      </w:tr>
+      <w:tr>
+        <w:tc>
+          <w:tcPr>
+            <w:tcW w:type="dxa" w:w="2970"/>
+            <w:tcBorders>
+              <w:top w:val="single" w:color="E8DADF" w:sz="4"/>
+              <w:left w:val="single" w:color="E8DADF" w:sz="4"/>
+              <w:bottom w:val="single" w:color="E8DADF" w:sz="4"/>
+              <w:right w:val="single" w:color="E8DADF" w:sz="4"/>
+            </w:tcBorders>
+            <w:tcMar>
+              <w:top w:type="dxa" w:w="80"/>
+              <w:left w:type="dxa" w:w="120"/>
+              <w:bottom w:type="dxa" w:w="80"/>
+              <w:right w:type="dxa" w:w="120"/>
+            </w:tcMar>
+          </w:tcPr>
+          <w:p>
+            <w:r>
+              <w:rPr>
+                <w:color w:val="1F2937"/>
+                <w:sz w:val="19"/>
+                <w:szCs w:val="19"/>
+              </w:rPr>
+              <w:t xml:space="preserve">The four stages</w:t>
+            </w:r>
+          </w:p>
+        </w:tc>
+        <w:tc>
+          <w:tcPr>
+            <w:tcW w:type="dxa" w:w="2475"/>
+            <w:tcBorders>
+              <w:top w:val="single" w:color="E8DADF" w:sz="4"/>
+              <w:left w:val="single" w:color="E8DADF" w:sz="4"/>
+              <w:bottom w:val="single" w:color="E8DADF" w:sz="4"/>
+              <w:right w:val="single" w:color="E8DADF" w:sz="4"/>
+            </w:tcBorders>
+            <w:tcMar>
+              <w:top w:type="dxa" w:w="80"/>
+              <w:left w:type="dxa" w:w="120"/>
+              <w:bottom w:type="dxa" w:w="80"/>
+              <w:right w:type="dxa" w:w="120"/>
+            </w:tcMar>
+          </w:tcPr>
+          <w:p>
+            <w:r>
+              <w:rPr>
+                <w:color w:val="1F2937"/>
+                <w:sz w:val="19"/>
+                <w:szCs w:val="19"/>
+              </w:rPr>
+              <w:t xml:space="preserve">Blue #2563EB, orange #EA580C, green #16A34A, purple #7C3AED</w:t>
+            </w:r>
+          </w:p>
+        </w:tc>
+        <w:tc>
+          <w:tcPr>
+            <w:tcW w:type="dxa" w:w="4455"/>
+            <w:tcBorders>
+              <w:top w:val="single" w:color="E8DADF" w:sz="4"/>
+              <w:left w:val="single" w:color="E8DADF" w:sz="4"/>
+              <w:bottom w:val="single" w:color="E8DADF" w:sz="4"/>
+              <w:right w:val="single" w:color="E8DADF" w:sz="4"/>
+            </w:tcBorders>
+            <w:tcMar>
+              <w:top w:type="dxa" w:w="80"/>
+              <w:left w:type="dxa" w:w="120"/>
+              <w:bottom w:type="dxa" w:w="80"/>
+              <w:right w:type="dxa" w:w="120"/>
+            </w:tcMar>
+          </w:tcPr>
+          <w:p>
+            <w:r>
+              <w:rPr>
+                <w:color w:val="1F2937"/>
+                <w:sz w:val="19"/>
+                <w:szCs w:val="19"/>
+              </w:rPr>
+              <w:t xml:space="preserve">Stage table, the Stage 1 to 4 banners at the top of each stage card, four-stages comic and Service Recovery Path. In the Level 4 Q2 dropdown each stage name is shown in its colour; this matches the notes but does not show which line belongs to which stage.</w:t>
             </w:r>
           </w:p>
         </w:tc>
@@ -1948,7 +2233,61 @@
           <w:sz w:val="20"/>
           <w:szCs w:val="20"/>
         </w:rPr>
-        <w:t xml:space="preserve">Works at phone width (360px), on Chromebooks and on laptops. Hints, tips and fold-outs open on tap, never on hover only.</w:t>
+        <w:t xml:space="preserve">Works on students' PLDs (Chromebooks and iPads), on laptops and at phone width (360px). Hints, tips and fold-outs open on tap, never on hover only.</w:t>
+      </w:r>
+    </w:p>
+    <w:p>
+      <w:pPr>
+        <w:pStyle w:val="ListParagraph"/>
+        <w:numPr>
+          <w:ilvl w:val="0"/>
+          <w:numId w:val="2"/>
+        </w:numPr>
+        <w:spacing w:after="60"/>
+      </w:pPr>
+      <w:r>
+        <w:rPr>
+          <w:color w:val="1F2937"/>
+          <w:sz w:val="20"/>
+          <w:szCs w:val="20"/>
+        </w:rPr>
+        <w:t xml:space="preserve">Every level page starts with the same header: the level icon, "Level {n}: {title}" and the level description underneath.</w:t>
+      </w:r>
+    </w:p>
+    <w:p>
+      <w:pPr>
+        <w:pStyle w:val="ListParagraph"/>
+        <w:numPr>
+          <w:ilvl w:val="0"/>
+          <w:numId w:val="2"/>
+        </w:numPr>
+        <w:spacing w:after="60"/>
+      </w:pPr>
+      <w:r>
+        <w:rPr>
+          <w:color w:val="1F2937"/>
+          <w:sz w:val="20"/>
+          <w:szCs w:val="20"/>
+        </w:rPr>
+        <w:t xml:space="preserve">🆕 0.12.0: One rule for typed answers: every box where students write a sentence needs at least 20 characters (from the next submit; work already submitted is not re-checked), and the screen and pop-ups say "at least one full sentence" rather than "characters". Boxes that expect one word or a link are exempt (Level 4 "Skill or quality" and the conversation link boxes).</w:t>
+      </w:r>
+    </w:p>
+    <w:p>
+      <w:pPr>
+        <w:pStyle w:val="ListParagraph"/>
+        <w:numPr>
+          <w:ilvl w:val="0"/>
+          <w:numId w:val="2"/>
+        </w:numPr>
+        <w:spacing w:after="60"/>
+      </w:pPr>
+      <w:r>
+        <w:rPr>
+          <w:color w:val="1F2937"/>
+          <w:sz w:val="20"/>
+          <w:szCs w:val="20"/>
+        </w:rPr>
+        <w:t xml:space="preserve">🆕 0.12.0: Every "⚠️ Not finished yet" pop-up lists everything missing in one go, and labels each item exactly as the question is labelled on screen (Q1, Q2, …). "Box 2" and similar labels are never used.</w:t>
       </w:r>
     </w:p>
     <w:p>
@@ -2260,7 +2599,7 @@
                 <w:sz w:val="19"/>
                 <w:szCs w:val="19"/>
               </w:rPr>
-              <w:t xml:space="preserve">Headings with icons, definition boxes for textbook definitions, bold key words inside textbook lines, numbered stages, parts and steps, and stage colours in the notes.</w:t>
+              <w:t xml:space="preserve">Headings with icons, definition boxes for textbook definitions, bold orange key words inside textbook lines, numbered stages, parts and steps, a coloured banner at the top of every stage card, and stage colours in the notes.</w:t>
             </w:r>
           </w:p>
         </w:tc>
@@ -3019,7 +3358,7 @@
                 <w:sz w:val="20"/>
                 <w:szCs w:val="20"/>
               </w:rPr>
-              <w:t xml:space="preserve">Footer (every page): Teacher Mode · Reset progress · Unlock / A team effort by Anthony, Daniel, Joshua and Jufinnie (NIE 2026) / Version 0.11.0.</w:t>
+              <w:t xml:space="preserve">Footer (every page): Teacher Mode · Reset progress · Unlock / A team effort by Anthony, Daniel, Joshua and Jufinnie (NIE 2026) / Version 0.12.0.</w:t>
             </w:r>
           </w:p>
         </w:tc>
@@ -4187,6 +4526,19 @@
             </w:pPr>
             <w:r>
               <w:rPr>
+                <w:color w:val="1F2937"/>
+                <w:sz w:val="20"/>
+                <w:szCs w:val="20"/>
+              </w:rPr>
+              <w:t xml:space="preserve">Each level card has an illustrated icon (ICON_STORIES, ICON_LEARN, ICON_ALEX, ICON_SERVE, ICON_RECOVER, ICON_CHECK; Section F) beside its number and title.</w:t>
+            </w:r>
+          </w:p>
+          <w:p>
+            <w:pPr>
+              <w:spacing w:after="60"/>
+            </w:pPr>
+            <w:r>
+              <w:rPr>
                 <w:b/>
                 <w:bCs/>
                 <w:color w:val="1F2937"/>
@@ -4218,7 +4570,7 @@
                 <w:sz w:val="20"/>
                 <w:szCs w:val="20"/>
               </w:rPr>
-              <w:t xml:space="preserve">1 📝 </w:t>
+              <w:t xml:space="preserve">1 </w:t>
             </w:r>
             <w:r>
               <w:rPr>
@@ -4253,7 +4605,7 @@
                 <w:sz w:val="20"/>
                 <w:szCs w:val="20"/>
               </w:rPr>
-              <w:t xml:space="preserve">2 🎓 </w:t>
+              <w:t xml:space="preserve">2 </w:t>
             </w:r>
             <w:r>
               <w:rPr>
@@ -4288,7 +4640,7 @@
                 <w:sz w:val="20"/>
                 <w:szCs w:val="20"/>
               </w:rPr>
-              <w:t xml:space="preserve">3 🎓 </w:t>
+              <w:t xml:space="preserve">3 </w:t>
             </w:r>
             <w:r>
               <w:rPr>
@@ -4323,7 +4675,7 @@
                 <w:sz w:val="20"/>
                 <w:szCs w:val="20"/>
               </w:rPr>
-              <w:t xml:space="preserve">4 💬 </w:t>
+              <w:t xml:space="preserve">4 </w:t>
             </w:r>
             <w:r>
               <w:rPr>
@@ -4358,7 +4710,7 @@
                 <w:sz w:val="20"/>
                 <w:szCs w:val="20"/>
               </w:rPr>
-              <w:t xml:space="preserve">5 🛍️ </w:t>
+              <w:t xml:space="preserve">5 </w:t>
             </w:r>
             <w:r>
               <w:rPr>
@@ -4393,7 +4745,7 @@
                 <w:sz w:val="20"/>
                 <w:szCs w:val="20"/>
               </w:rPr>
-              <w:t xml:space="preserve">6 🛠️ </w:t>
+              <w:t xml:space="preserve">6 </w:t>
             </w:r>
             <w:r>
               <w:rPr>
@@ -4428,7 +4780,7 @@
                 <w:sz w:val="20"/>
                 <w:szCs w:val="20"/>
               </w:rPr>
-              <w:t xml:space="preserve">7 ✅ </w:t>
+              <w:t xml:space="preserve">7 </w:t>
             </w:r>
             <w:r>
               <w:rPr>
@@ -4482,7 +4834,7 @@
                 <w:sz w:val="20"/>
                 <w:szCs w:val="20"/>
               </w:rPr>
-              <w:t xml:space="preserve">: Story Sharer, Service Scholar, {Level 3 badge, to come}, Service Spotter, Service Star, Service Superstar, Completion Champion (greyed out until earned).</w:t>
+              <w:t xml:space="preserve">: Story Sharer, Service Scholar, Service Saver, Service Spotter, Service Star, Service Superstar, Completion Champion (greyed out until earned).</w:t>
             </w:r>
           </w:p>
           <w:p>
@@ -5413,17 +5765,17 @@
                 <w:sz w:val="20"/>
                 <w:szCs w:val="20"/>
               </w:rPr>
-              <w:t xml:space="preserve">Level header: </w:t>
-            </w:r>
-            <w:r>
-              <w:rPr>
-                <w:b/>
-                <w:bCs/>
-                <w:color w:val="1F2937"/>
-                <w:sz w:val="20"/>
-                <w:szCs w:val="20"/>
-              </w:rPr>
-              <w:t xml:space="preserve">📝 Level 1: Your Customer Service Stories</w:t>
+              <w:t xml:space="preserve">Level header: [ICON_STORIES] </w:t>
+            </w:r>
+            <w:r>
+              <w:rPr>
+                <w:b/>
+                <w:bCs/>
+                <w:color w:val="1F2937"/>
+                <w:sz w:val="20"/>
+                <w:szCs w:val="20"/>
+              </w:rPr>
+              <w:t xml:space="preserve">Level 1: Your Customer Service Stories</w:t>
             </w:r>
             <w:r>
               <w:rPr>
@@ -5505,7 +5857,7 @@
                 <w:sz w:val="20"/>
                 <w:szCs w:val="20"/>
               </w:rPr>
-              <w:t xml:space="preserve">1.</w:t>
+              <w:t xml:space="preserve">Q1.</w:t>
             </w:r>
             <w:r>
               <w:rPr>
@@ -5540,7 +5892,7 @@
                 <w:sz w:val="20"/>
                 <w:szCs w:val="20"/>
               </w:rPr>
-              <w:t xml:space="preserve">2.</w:t>
+              <w:t xml:space="preserve">Q2.</w:t>
             </w:r>
             <w:r>
               <w:rPr>
@@ -5575,7 +5927,7 @@
                 <w:sz w:val="20"/>
                 <w:szCs w:val="20"/>
               </w:rPr>
-              <w:t xml:space="preserve">3.</w:t>
+              <w:t xml:space="preserve">Q3.</w:t>
             </w:r>
             <w:r>
               <w:rPr>
@@ -5600,7 +5952,20 @@
                 <w:sz w:val="20"/>
                 <w:szCs w:val="20"/>
               </w:rPr>
-              <w:t xml:space="preserve">Type at least one sentence (at least 20 characters) in each box, then tap Submit.</w:t>
+              <w:t xml:space="preserve">Type at least one full sentence in each box, then tap Submit.</w:t>
+            </w:r>
+          </w:p>
+          <w:p>
+            <w:pPr>
+              <w:spacing w:after="60"/>
+            </w:pPr>
+            <w:r>
+              <w:rPr>
+                <w:color w:val="1F2937"/>
+                <w:sz w:val="20"/>
+                <w:szCs w:val="20"/>
+              </w:rPr>
+              <w:t xml:space="preserve">🆕 0.12.0: Question numbers shown as Q1, Q2 and Q3 (were 1, 2 and 3), and the instruction no longer says "characters".</w:t>
             </w:r>
           </w:p>
           <w:p>
@@ -5687,7 +6052,7 @@
                 <w:sz w:val="20"/>
                 <w:szCs w:val="20"/>
               </w:rPr>
-              <w:t xml:space="preserve">Any box under 20 characters: "⚠️ Not finished yet" pop-up listing "Box {n}: Write at least 20 characters", marked in red, with [Go back].</w:t>
+              <w:t xml:space="preserve">🆕 0.12.0: Any box empty or under 20 characters: one "⚠️ Not finished yet" pop-up listing every such box as "✗ Q{n}: Write at least one full sentence", marked in red, with [Go back].</w:t>
             </w:r>
           </w:p>
           <w:p>
@@ -5904,7 +6269,27 @@
           <w:sz w:val="20"/>
           <w:szCs w:val="20"/>
         </w:rPr>
-        <w:t xml:space="preserve">Level card description: "Short notes on quality customer service, approaching customers and presenting product information." 13 cards, one idea each, shown one at a time. Under the level title, a progress line reads "{n} of 13 · {card name}" with a progress bar. Back and Next sit in a sticky bar at the bottom; the last card's button reads Finish Level 2. Every notes card has 🔊 Read aloud, and every picture has 🔍 Tap to enlarge. Nothing in Levels 2 and 3 is scored. Next is held back on card 8 (Think about it, at least 20 characters) and on the two quick checks (every item settled).</w:t>
+        <w:t xml:space="preserve">Level card description: "Short notes on quality customer service, approaching customers and presenting product information." 13 cards, one idea each, shown one at a time. The level header is the same as in every level: [ICON_LEARN] </w:t>
+      </w:r>
+      <w:r>
+        <w:rPr>
+          <w:i/>
+          <w:iCs/>
+          <w:color w:val="1F2937"/>
+          <w:sz w:val="20"/>
+          <w:szCs w:val="20"/>
+        </w:rPr>
+        <w:t xml:space="preserve">Level 2: Learn: Customer Service (Part 1)</w:t>
+      </w:r>
+      <w:r>
+        <w:rPr>
+          <w:i/>
+          <w:iCs/>
+          <w:color w:val="1F2937"/>
+          <w:sz w:val="20"/>
+          <w:szCs w:val="20"/>
+        </w:rPr>
+        <w:t xml:space="preserve"> with the description underneath. Under it, a progress line reads "{n} of 13 · {card name}" with a progress bar. Back and Next sit in a sticky bar at the bottom; the last card's button reads Finish Level 2. Every notes card has 🔊 Read aloud, and every picture has 🔍 Tap to enlarge. Nothing in Levels 2 and 3 is scored. Next is held back on card 8 (Think about it, at least one full sentence) and on the two quick checks (every item settled).</w:t>
       </w:r>
     </w:p>
     <w:tbl>
@@ -8575,20 +8960,43 @@
                 <w:sz w:val="20"/>
                 <w:szCs w:val="20"/>
               </w:rPr>
-              <w:t xml:space="preserve">Product knowledge includes:</w:t>
-            </w:r>
-          </w:p>
-          <w:p>
-            <w:pPr>
-              <w:spacing w:after="60"/>
-            </w:pPr>
-            <w:r>
-              <w:rPr>
-                <w:color w:val="1F2937"/>
-                <w:sz w:val="20"/>
-                <w:szCs w:val="20"/>
-              </w:rPr>
-              <w:t xml:space="preserve">Five headings, each with a Nexora comic whose speech bubble shows the staff member's line:</w:t>
+              <w:t xml:space="preserve">🎯 Service staff with good product knowledge will be able to </w:t>
+            </w:r>
+            <w:r>
+              <w:rPr>
+                <w:b/>
+                <w:bCs/>
+                <w:color w:val="1F2937"/>
+                <w:sz w:val="20"/>
+                <w:szCs w:val="20"/>
+              </w:rPr>
+              <w:t xml:space="preserve">meet the needs and wants of customers</w:t>
+            </w:r>
+            <w:r>
+              <w:rPr>
+                <w:color w:val="1F2937"/>
+                <w:sz w:val="20"/>
+                <w:szCs w:val="20"/>
+              </w:rPr>
+              <w:t xml:space="preserve"> and </w:t>
+            </w:r>
+            <w:r>
+              <w:rPr>
+                <w:b/>
+                <w:bCs/>
+                <w:color w:val="1F2937"/>
+                <w:sz w:val="20"/>
+                <w:szCs w:val="20"/>
+              </w:rPr>
+              <w:t xml:space="preserve">increase customer satisfaction</w:t>
+            </w:r>
+            <w:r>
+              <w:rPr>
+                <w:color w:val="1F2937"/>
+                <w:sz w:val="20"/>
+                <w:szCs w:val="20"/>
+              </w:rPr>
+              <w:t xml:space="preserve"> so that they will want to come back again. (second definition box, directly under the first, 16px apart)</w:t>
             </w:r>
           </w:p>
           <w:p>
@@ -8605,32 +9013,20 @@
                 <w:sz w:val="20"/>
                 <w:szCs w:val="20"/>
               </w:rPr>
-              <w:t xml:space="preserve">📋 Product features and benefits (e.g. a large screen that makes reading easier)</w:t>
-            </w:r>
-          </w:p>
-          <w:p>
-            <w:pPr>
-              <w:spacing w:after="60"/>
-            </w:pPr>
-            <w:r>
-              <w:rPr>
-                <w:b/>
-                <w:bCs/>
-                <w:color w:val="9B1C1C"/>
-                <w:sz w:val="20"/>
-                <w:szCs w:val="20"/>
-              </w:rPr>
-              <w:t xml:space="preserve">[Image PK_FEATURES]</w:t>
-            </w:r>
-            <w:r>
-              <w:rPr>
-                <w:b/>
-                <w:bCs/>
-                <w:color w:val="9B1C1C"/>
-                <w:sz w:val="20"/>
-                <w:szCs w:val="20"/>
-              </w:rPr>
-              <w:t xml:space="preserve"> "The Nexora Spark has a large screen for reading and an all-day battery."</w:t>
+              <w:t xml:space="preserve">Product knowledge includes:</w:t>
+            </w:r>
+          </w:p>
+          <w:p>
+            <w:pPr>
+              <w:spacing w:after="60"/>
+            </w:pPr>
+            <w:r>
+              <w:rPr>
+                <w:color w:val="1F2937"/>
+                <w:sz w:val="20"/>
+                <w:szCs w:val="20"/>
+              </w:rPr>
+              <w:t xml:space="preserve">Five headings, each with a Nexora comic whose speech bubble shows the staff member's line:</w:t>
             </w:r>
           </w:p>
           <w:p>
@@ -8647,7 +9043,7 @@
                 <w:sz w:val="20"/>
                 <w:szCs w:val="20"/>
               </w:rPr>
-              <w:t xml:space="preserve">💲 Price and available options</w:t>
+              <w:t xml:space="preserve">📋 Product features and benefits (e.g. a large screen that makes reading easier)</w:t>
             </w:r>
           </w:p>
           <w:p>
@@ -8662,7 +9058,7 @@
                 <w:sz w:val="20"/>
                 <w:szCs w:val="20"/>
               </w:rPr>
-              <w:t xml:space="preserve">[Image PK_PRICE]</w:t>
+              <w:t xml:space="preserve">[Image PK_FEATURES]</w:t>
             </w:r>
             <w:r>
               <w:rPr>
@@ -8672,7 +9068,7 @@
                 <w:sz w:val="20"/>
                 <w:szCs w:val="20"/>
               </w:rPr>
-              <w:t xml:space="preserve"> "The Nexora Core is $799. You can upgrade to 256GB for $80 more, or 512GB for $160 more."</w:t>
+              <w:t xml:space="preserve"> "The Nexora Spark has a large screen for reading and an all-day battery."</w:t>
             </w:r>
           </w:p>
           <w:p>
@@ -8689,7 +9085,7 @@
                 <w:sz w:val="20"/>
                 <w:szCs w:val="20"/>
               </w:rPr>
-              <w:t xml:space="preserve">🧴 How to use or care for the product</w:t>
+              <w:t xml:space="preserve">💲 Price and available options</w:t>
             </w:r>
           </w:p>
           <w:p>
@@ -8704,7 +9100,7 @@
                 <w:sz w:val="20"/>
                 <w:szCs w:val="20"/>
               </w:rPr>
-              <w:t xml:space="preserve">[Image PK_CARE]</w:t>
+              <w:t xml:space="preserve">[Image PK_PRICE]</w:t>
             </w:r>
             <w:r>
               <w:rPr>
@@ -8714,7 +9110,7 @@
                 <w:sz w:val="20"/>
                 <w:szCs w:val="20"/>
               </w:rPr>
-              <w:t xml:space="preserve"> "You may use a protective case and wipe the screen with a soft, dry cloth to maintain its condition."</w:t>
+              <w:t xml:space="preserve"> "The Nexora Core is $799. You can upgrade to 256GB for $80 more, or 512GB for $160 more."</w:t>
             </w:r>
           </w:p>
           <w:p>
@@ -8731,7 +9127,7 @@
                 <w:sz w:val="20"/>
                 <w:szCs w:val="20"/>
               </w:rPr>
-              <w:t xml:space="preserve">🛡️ Warranty and after-sales support</w:t>
+              <w:t xml:space="preserve">🧴 How to use or care for the product</w:t>
             </w:r>
           </w:p>
           <w:p>
@@ -8746,7 +9142,7 @@
                 <w:sz w:val="20"/>
                 <w:szCs w:val="20"/>
               </w:rPr>
-              <w:t xml:space="preserve">[Image PK_WARRANTY]</w:t>
+              <w:t xml:space="preserve">[Image PK_CARE]</w:t>
             </w:r>
             <w:r>
               <w:rPr>
@@ -8756,7 +9152,7 @@
                 <w:sz w:val="20"/>
                 <w:szCs w:val="20"/>
               </w:rPr>
-              <w:t xml:space="preserve"> "Every Nexora phone has a 1-year warranty for manufacturing defects. Keep your receipt, and bring the phone to our Nexora Care Bar if anything goes wrong."</w:t>
+              <w:t xml:space="preserve"> "You may use a protective case and wipe the screen with a soft, dry cloth to maintain its condition."</w:t>
             </w:r>
           </w:p>
           <w:p>
@@ -8773,7 +9169,7 @@
                 <w:sz w:val="20"/>
                 <w:szCs w:val="20"/>
               </w:rPr>
-              <w:t xml:space="preserve">⭐ Unique selling points of the product (why your product is better than competitors' products)</w:t>
+              <w:t xml:space="preserve">🛡️ Warranty and after-sales support</w:t>
             </w:r>
           </w:p>
           <w:p>
@@ -8788,7 +9184,7 @@
                 <w:sz w:val="20"/>
                 <w:szCs w:val="20"/>
               </w:rPr>
-              <w:t xml:space="preserve">[Image PK_SELLING_POINT]</w:t>
+              <w:t xml:space="preserve">[Image PK_WARRANTY]</w:t>
             </w:r>
             <w:r>
               <w:rPr>
@@ -8798,7 +9194,7 @@
                 <w:sz w:val="20"/>
                 <w:szCs w:val="20"/>
               </w:rPr>
-              <w:t xml:space="preserve"> "Compared with many phones at this price, the Nexora Spark's all-day battery lasts longer, so it suits you if you use your phone often."</w:t>
+              <w:t xml:space="preserve"> "Every Nexora phone has a 1-year warranty for manufacturing defects. Keep your receipt, and bring the phone to our Nexora Care Bar if anything goes wrong."</w:t>
             </w:r>
           </w:p>
           <w:p>
@@ -8815,43 +9211,45 @@
                 <w:sz w:val="20"/>
                 <w:szCs w:val="20"/>
               </w:rPr>
-              <w:t xml:space="preserve">Service staff with good product knowledge will be able to </w:t>
-            </w:r>
-            <w:r>
-              <w:rPr>
-                <w:b/>
-                <w:bCs/>
-                <w:color w:val="1F2937"/>
-                <w:sz w:val="20"/>
-                <w:szCs w:val="20"/>
-              </w:rPr>
-              <w:t xml:space="preserve">meet the needs and wants of customers</w:t>
-            </w:r>
-            <w:r>
-              <w:rPr>
-                <w:color w:val="1F2937"/>
-                <w:sz w:val="20"/>
-                <w:szCs w:val="20"/>
-              </w:rPr>
-              <w:t xml:space="preserve"> and </w:t>
-            </w:r>
-            <w:r>
-              <w:rPr>
-                <w:b/>
-                <w:bCs/>
-                <w:color w:val="1F2937"/>
-                <w:sz w:val="20"/>
-                <w:szCs w:val="20"/>
-              </w:rPr>
-              <w:t xml:space="preserve">increase customer satisfaction</w:t>
-            </w:r>
-            <w:r>
-              <w:rPr>
-                <w:color w:val="1F2937"/>
-                <w:sz w:val="20"/>
-                <w:szCs w:val="20"/>
-              </w:rPr>
-              <w:t xml:space="preserve"> so that they will want to come back again.</w:t>
+              <w:t xml:space="preserve">⭐ Unique selling points of the product (why your product is better than competitors' products)</w:t>
+            </w:r>
+          </w:p>
+          <w:p>
+            <w:pPr>
+              <w:spacing w:after="60"/>
+            </w:pPr>
+            <w:r>
+              <w:rPr>
+                <w:b/>
+                <w:bCs/>
+                <w:color w:val="9B1C1C"/>
+                <w:sz w:val="20"/>
+                <w:szCs w:val="20"/>
+              </w:rPr>
+              <w:t xml:space="preserve">[Image PK_SELLING_POINT]</w:t>
+            </w:r>
+            <w:r>
+              <w:rPr>
+                <w:b/>
+                <w:bCs/>
+                <w:color w:val="9B1C1C"/>
+                <w:sz w:val="20"/>
+                <w:szCs w:val="20"/>
+              </w:rPr>
+              <w:t xml:space="preserve"> "Compared with many phones at this price, the Nexora Spark's all-day battery lasts longer, so it suits you if you use your phone often."</w:t>
+            </w:r>
+          </w:p>
+          <w:p>
+            <w:pPr>
+              <w:spacing w:after="60"/>
+            </w:pPr>
+            <w:r>
+              <w:rPr>
+                <w:color w:val="1F2937"/>
+                <w:sz w:val="20"/>
+                <w:szCs w:val="20"/>
+              </w:rPr>
+              <w:t xml:space="preserve">On Chromebook and laptop widths the five comics sit two per row, with the fifth centred; on phones they stack.</w:t>
             </w:r>
           </w:p>
         </w:tc>
@@ -8917,7 +9315,7 @@
                 <w:sz w:val="18"/>
                 <w:szCs w:val="18"/>
               </w:rPr>
-              <w:t xml:space="preserve">Definition and the last sentence: textbook p. 127, word for word. The five aspects follow the textbook's retail list and the syllabus outcome "identify aspects of product knowledge". The Nexora facts match the Nexora business profile. Read aloud reads each heading followed by its comic line.</w:t>
+              <w:t xml:space="preserve">Definition and the benefits sentence: textbook p. 127, word for word. The benefits sentence moved up into its own definition box in 0.11.3, so students read why product knowledge matters before the list. The five aspects follow the textbook's retail list and the syllabus outcome "identify aspects of product knowledge". The Nexora facts match the Nexora business profile. Read aloud reads each heading followed by its comic line.</w:t>
             </w:r>
           </w:p>
         </w:tc>
@@ -9405,35 +9803,29 @@
             </w:pPr>
             <w:r>
               <w:rPr>
-                <w:color w:val="1F2937"/>
-                <w:sz w:val="20"/>
-                <w:szCs w:val="20"/>
-              </w:rPr>
-              <w:t xml:space="preserve">Label </w:t>
-            </w:r>
-            <w:r>
-              <w:rPr>
-                <w:b/>
-                <w:bCs/>
-                <w:color w:val="1F2937"/>
-                <w:sz w:val="20"/>
-                <w:szCs w:val="20"/>
-              </w:rPr>
-              <w:t xml:space="preserve">👋 Stage 1</w:t>
-            </w:r>
-            <w:r>
-              <w:rPr>
-                <w:color w:val="1F2937"/>
-                <w:sz w:val="20"/>
-                <w:szCs w:val="20"/>
-              </w:rPr>
-              <w:t xml:space="preserve"> (blue bar), heading </w:t>
-            </w:r>
-            <w:r>
-              <w:rPr>
-                <w:b/>
-                <w:bCs/>
-                <w:color w:val="1F2937"/>
+                <w:b/>
+                <w:bCs/>
+                <w:color w:val="9B1C1C"/>
+                <w:sz w:val="20"/>
+                <w:szCs w:val="20"/>
+              </w:rPr>
+              <w:t xml:space="preserve">[Image STAGE1_BANNER]</w:t>
+            </w:r>
+            <w:r>
+              <w:rPr>
+                <w:b/>
+                <w:bCs/>
+                <w:color w:val="9B1C1C"/>
+                <w:sz w:val="20"/>
+                <w:szCs w:val="20"/>
+              </w:rPr>
+              <w:t xml:space="preserve"> Stage 1 banner (blue), then heading </w:t>
+            </w:r>
+            <w:r>
+              <w:rPr>
+                <w:b/>
+                <w:bCs/>
+                <w:color w:val="9B1C1C"/>
                 <w:sz w:val="20"/>
                 <w:szCs w:val="20"/>
               </w:rPr>
@@ -10126,7 +10518,7 @@
                 <w:sz w:val="20"/>
                 <w:szCs w:val="20"/>
               </w:rPr>
-              <w:t xml:space="preserve">What did Alex do to make June feel welcome? Why did she bring her friend back? [box, hint "Write at least 20 characters..."]</w:t>
+              <w:t xml:space="preserve">What did Alex do to make June feel welcome? Why did she bring her friend back? [box, hint "Write at least one full sentence..."]</w:t>
             </w:r>
           </w:p>
           <w:p>
@@ -10208,7 +10600,7 @@
                 <w:sz w:val="20"/>
                 <w:szCs w:val="20"/>
               </w:rPr>
-              <w:t xml:space="preserve">Next with fewer than 20 characters: pop-up "Answer too short" ("Your answer is too short. Write at least 20 characters in each answer.") or "Complete all questions" if empty, with [Back to questions].</w:t>
+              <w:t xml:space="preserve">🆕 0.12.0: Next with an answer under 20 characters: pop-up "Answer too short" ("Your answer is too short. Write at least one full sentence in each box.") or, if empty, "Complete all questions" ("Please complete all questions before moving on. Write at least one full sentence in each box."), with [Back to questions]. The same pop-ups are used on Level 3 cards 6 and 7.</w:t>
             </w:r>
           </w:p>
         </w:tc>
@@ -10416,7 +10808,7 @@
                 <w:sz w:val="20"/>
                 <w:szCs w:val="20"/>
               </w:rPr>
-              <w:t xml:space="preserve">Tap one for each.</w:t>
+              <w:t xml:space="preserve">Select the most appropriate approach for each question.</w:t>
             </w:r>
           </w:p>
           <w:p>
@@ -10784,35 +11176,29 @@
             </w:pPr>
             <w:r>
               <w:rPr>
-                <w:color w:val="1F2937"/>
-                <w:sz w:val="20"/>
-                <w:szCs w:val="20"/>
-              </w:rPr>
-              <w:t xml:space="preserve">Label </w:t>
-            </w:r>
-            <w:r>
-              <w:rPr>
-                <w:b/>
-                <w:bCs/>
-                <w:color w:val="1F2937"/>
-                <w:sz w:val="20"/>
-                <w:szCs w:val="20"/>
-              </w:rPr>
-              <w:t xml:space="preserve">📱 Stage 2</w:t>
-            </w:r>
-            <w:r>
-              <w:rPr>
-                <w:color w:val="1F2937"/>
-                <w:sz w:val="20"/>
-                <w:szCs w:val="20"/>
-              </w:rPr>
-              <w:t xml:space="preserve"> (orange bar), heading </w:t>
-            </w:r>
-            <w:r>
-              <w:rPr>
-                <w:b/>
-                <w:bCs/>
-                <w:color w:val="1F2937"/>
+                <w:b/>
+                <w:bCs/>
+                <w:color w:val="9B1C1C"/>
+                <w:sz w:val="20"/>
+                <w:szCs w:val="20"/>
+              </w:rPr>
+              <w:t xml:space="preserve">[Image STAGE2_BANNER]</w:t>
+            </w:r>
+            <w:r>
+              <w:rPr>
+                <w:b/>
+                <w:bCs/>
+                <w:color w:val="9B1C1C"/>
+                <w:sz w:val="20"/>
+                <w:szCs w:val="20"/>
+              </w:rPr>
+              <w:t xml:space="preserve"> Stage 2 banner (orange), heading </w:t>
+            </w:r>
+            <w:r>
+              <w:rPr>
+                <w:b/>
+                <w:bCs/>
+                <w:color w:val="9B1C1C"/>
                 <w:sz w:val="20"/>
                 <w:szCs w:val="20"/>
               </w:rPr>
@@ -10820,7 +11206,9 @@
             </w:r>
             <w:r>
               <w:rPr>
-                <w:color w:val="1F2937"/>
+                <w:b/>
+                <w:bCs/>
+                <w:color w:val="9B1C1C"/>
                 <w:sz w:val="20"/>
                 <w:szCs w:val="20"/>
               </w:rPr>
@@ -10830,7 +11218,7 @@
               <w:rPr>
                 <w:b/>
                 <w:bCs/>
-                <w:color w:val="1F2937"/>
+                <w:color w:val="9B1C1C"/>
                 <w:sz w:val="20"/>
                 <w:szCs w:val="20"/>
               </w:rPr>
@@ -11212,7 +11600,7 @@
                 <w:sz w:val="20"/>
                 <w:szCs w:val="20"/>
               </w:rPr>
-              <w:t xml:space="preserve">Stage 2 label and heading, part heading </w:t>
+              <w:t xml:space="preserve">Stage 2 banner and heading, part heading </w:t>
             </w:r>
             <w:r>
               <w:rPr>
@@ -11693,7 +12081,7 @@
                 <w:sz w:val="20"/>
                 <w:szCs w:val="20"/>
               </w:rPr>
-              <w:t xml:space="preserve">Stage 2 label and heading, part heading </w:t>
+              <w:t xml:space="preserve">Stage 2 banner and heading, part heading </w:t>
             </w:r>
             <w:r>
               <w:rPr>
@@ -11992,7 +12380,7 @@
                 <w:sz w:val="20"/>
                 <w:szCs w:val="20"/>
               </w:rPr>
-              <w:t xml:space="preserve"> Handling objections comic: the four examples acted out</w:t>
+              <w:t xml:space="preserve"> Handling objections comic (v2): the four examples acted out</w:t>
             </w:r>
           </w:p>
         </w:tc>
@@ -12213,7 +12601,7 @@
                 <w:sz w:val="20"/>
                 <w:szCs w:val="20"/>
               </w:rPr>
-              <w:t xml:space="preserve">Each item shows a Customer line and a Staff line, then four options (2 by 2 on phones, in a row on laptops), always in this order: [Negative into selling point] [Yes, but] [Share concerns] [Correct misconception]</w:t>
+              <w:t xml:space="preserve">Each item shows a Customer line (light purple box) and a Staff line (pale blue box), each with its speaker label, then four options (2 by 2 on phones, in a row on laptops), always in this order: [Negative into selling point] [Yes, but] [Share concerns] [Correct misconception]</w:t>
             </w:r>
           </w:p>
           <w:p>
@@ -12599,7 +12987,27 @@
           <w:sz w:val="20"/>
           <w:szCs w:val="20"/>
         </w:rPr>
-        <w:t xml:space="preserve">Level card description: "Short notes on closing positively, after-sales support and service recovery." 7 cards, shown one at a time in the same way as Level 2 ("{n} of 7 · {card name}"); the last card's button reads Finish Level 3. Next is held back on cards 6 and 7 (Think about it, at least 20 characters).</w:t>
+        <w:t xml:space="preserve">Level card description: "Short notes on closing positively, after-sales support and service recovery." 7 cards, shown one at a time in the same way as Level 2 ("{n} of 7 · {card name}"), under the same header ([ICON_LEARN] </w:t>
+      </w:r>
+      <w:r>
+        <w:rPr>
+          <w:i/>
+          <w:iCs/>
+          <w:color w:val="1F2937"/>
+          <w:sz w:val="20"/>
+          <w:szCs w:val="20"/>
+        </w:rPr>
+        <w:t xml:space="preserve">Level 3: Learn: Customer Service (Part 2)</w:t>
+      </w:r>
+      <w:r>
+        <w:rPr>
+          <w:i/>
+          <w:iCs/>
+          <w:color w:val="1F2937"/>
+          <w:sz w:val="20"/>
+          <w:szCs w:val="20"/>
+        </w:rPr>
+        <w:t xml:space="preserve"> with the description); the last card's button reads Finish Level 3. Next is held back on cards 6 and 7 (Think about it, at least one full sentence).</w:t>
       </w:r>
     </w:p>
     <w:tbl>
@@ -13409,39 +13817,23 @@
             </w:pPr>
             <w:r>
               <w:rPr>
-                <w:color w:val="1F2937"/>
-                <w:sz w:val="20"/>
-                <w:szCs w:val="20"/>
-              </w:rPr>
-              <w:t xml:space="preserve">Label </w:t>
-            </w:r>
-            <w:r>
-              <w:rPr>
-                <w:b/>
-                <w:bCs/>
-                <w:color w:val="1F2937"/>
-                <w:sz w:val="20"/>
-                <w:szCs w:val="20"/>
-              </w:rPr>
-              <w:t xml:space="preserve">✅ Stage 3</w:t>
-            </w:r>
-            <w:r>
-              <w:rPr>
-                <w:color w:val="1F2937"/>
-                <w:sz w:val="20"/>
-                <w:szCs w:val="20"/>
-              </w:rPr>
-              <w:t xml:space="preserve"> (green bar), heading </w:t>
-            </w:r>
-            <w:r>
-              <w:rPr>
-                <w:b/>
-                <w:bCs/>
-                <w:color w:val="1F2937"/>
-                <w:sz w:val="20"/>
-                <w:szCs w:val="20"/>
-              </w:rPr>
-              <w:t xml:space="preserve">✅ Closing the customer experience positively</w:t>
+                <w:b/>
+                <w:bCs/>
+                <w:color w:val="9B1C1C"/>
+                <w:sz w:val="20"/>
+                <w:szCs w:val="20"/>
+              </w:rPr>
+              <w:t xml:space="preserve">[Image STAGE3_BANNER]</w:t>
+            </w:r>
+            <w:r>
+              <w:rPr>
+                <w:b/>
+                <w:bCs/>
+                <w:color w:val="9B1C1C"/>
+                <w:sz w:val="20"/>
+                <w:szCs w:val="20"/>
+              </w:rPr>
+              <w:t xml:space="preserve"> Stage 3 banner (green). No heading under it: the banner names the stage (heading removed in 0.11.7 to avoid repeating it).</w:t>
             </w:r>
           </w:p>
           <w:p>
@@ -13684,7 +14076,7 @@
                 <w:sz w:val="20"/>
                 <w:szCs w:val="20"/>
               </w:rPr>
-              <w:t xml:space="preserve"> Closing comic: Signs of a positive experience, After a sale, If the customer does not buy</w:t>
+              <w:t xml:space="preserve"> Closing comic (v2): Signs of a positive experience, After a sale, If the customer does not buy</w:t>
             </w:r>
           </w:p>
         </w:tc>
@@ -13869,17 +14261,29 @@
             </w:pPr>
             <w:r>
               <w:rPr>
-                <w:color w:val="1F2937"/>
-                <w:sz w:val="20"/>
-                <w:szCs w:val="20"/>
-              </w:rPr>
-              <w:t xml:space="preserve">Stage 3 label, heading </w:t>
-            </w:r>
-            <w:r>
-              <w:rPr>
-                <w:b/>
-                <w:bCs/>
-                <w:color w:val="1F2937"/>
+                <w:b/>
+                <w:bCs/>
+                <w:color w:val="9B1C1C"/>
+                <w:sz w:val="20"/>
+                <w:szCs w:val="20"/>
+              </w:rPr>
+              <w:t xml:space="preserve">[Image STAGE3_BANNER]</w:t>
+            </w:r>
+            <w:r>
+              <w:rPr>
+                <w:b/>
+                <w:bCs/>
+                <w:color w:val="9B1C1C"/>
+                <w:sz w:val="20"/>
+                <w:szCs w:val="20"/>
+              </w:rPr>
+              <w:t xml:space="preserve"> Stage 3 banner, heading </w:t>
+            </w:r>
+            <w:r>
+              <w:rPr>
+                <w:b/>
+                <w:bCs/>
+                <w:color w:val="9B1C1C"/>
                 <w:sz w:val="20"/>
                 <w:szCs w:val="20"/>
               </w:rPr>
@@ -14431,35 +14835,29 @@
             </w:pPr>
             <w:r>
               <w:rPr>
-                <w:color w:val="1F2937"/>
-                <w:sz w:val="20"/>
-                <w:szCs w:val="20"/>
-              </w:rPr>
-              <w:t xml:space="preserve">Label </w:t>
-            </w:r>
-            <w:r>
-              <w:rPr>
-                <w:b/>
-                <w:bCs/>
-                <w:color w:val="1F2937"/>
-                <w:sz w:val="20"/>
-                <w:szCs w:val="20"/>
-              </w:rPr>
-              <w:t xml:space="preserve">🛠️ Stage 4</w:t>
-            </w:r>
-            <w:r>
-              <w:rPr>
-                <w:color w:val="1F2937"/>
-                <w:sz w:val="20"/>
-                <w:szCs w:val="20"/>
-              </w:rPr>
-              <w:t xml:space="preserve"> (purple bar), heading </w:t>
-            </w:r>
-            <w:r>
-              <w:rPr>
-                <w:b/>
-                <w:bCs/>
-                <w:color w:val="1F2937"/>
+                <w:b/>
+                <w:bCs/>
+                <w:color w:val="9B1C1C"/>
+                <w:sz w:val="20"/>
+                <w:szCs w:val="20"/>
+              </w:rPr>
+              <w:t xml:space="preserve">[Image STAGE4_BANNER]</w:t>
+            </w:r>
+            <w:r>
+              <w:rPr>
+                <w:b/>
+                <w:bCs/>
+                <w:color w:val="9B1C1C"/>
+                <w:sz w:val="20"/>
+                <w:szCs w:val="20"/>
+              </w:rPr>
+              <w:t xml:space="preserve"> Stage 4 banner (purple), heading </w:t>
+            </w:r>
+            <w:r>
+              <w:rPr>
+                <w:b/>
+                <w:bCs/>
+                <w:color w:val="9B1C1C"/>
                 <w:sz w:val="20"/>
                 <w:szCs w:val="20"/>
               </w:rPr>
@@ -14517,6 +14915,19 @@
                 <w:szCs w:val="20"/>
               </w:rPr>
               <w:t xml:space="preserve"> about a product or service. / Common causes: Unfriendly or unhelpful staff, a product that does not meet expectations, or an advertised product that is not available in the store.</w:t>
+            </w:r>
+          </w:p>
+          <w:p>
+            <w:pPr>
+              <w:spacing w:after="60"/>
+            </w:pPr>
+            <w:r>
+              <w:rPr>
+                <w:color w:val="1F2937"/>
+                <w:sz w:val="20"/>
+                <w:szCs w:val="20"/>
+              </w:rPr>
+              <w:t xml:space="preserve">(16px gap between the two definition boxes)</w:t>
             </w:r>
           </w:p>
           <w:p>
@@ -15487,35 +15898,29 @@
             </w:pPr>
             <w:r>
               <w:rPr>
-                <w:color w:val="1F2937"/>
-                <w:sz w:val="20"/>
-                <w:szCs w:val="20"/>
-              </w:rPr>
-              <w:t xml:space="preserve">Label </w:t>
-            </w:r>
-            <w:r>
-              <w:rPr>
-                <w:b/>
-                <w:bCs/>
-                <w:color w:val="1F2937"/>
-                <w:sz w:val="20"/>
-                <w:szCs w:val="20"/>
-              </w:rPr>
-              <w:t xml:space="preserve">🛠️ Stage 4</w:t>
-            </w:r>
-            <w:r>
-              <w:rPr>
-                <w:color w:val="1F2937"/>
-                <w:sz w:val="20"/>
-                <w:szCs w:val="20"/>
-              </w:rPr>
-              <w:t xml:space="preserve"> (purple bar), heading </w:t>
-            </w:r>
-            <w:r>
-              <w:rPr>
-                <w:b/>
-                <w:bCs/>
-                <w:color w:val="1F2937"/>
+                <w:b/>
+                <w:bCs/>
+                <w:color w:val="9B1C1C"/>
+                <w:sz w:val="20"/>
+                <w:szCs w:val="20"/>
+              </w:rPr>
+              <w:t xml:space="preserve">[Image STAGE4_BANNER]</w:t>
+            </w:r>
+            <w:r>
+              <w:rPr>
+                <w:b/>
+                <w:bCs/>
+                <w:color w:val="9B1C1C"/>
+                <w:sz w:val="20"/>
+                <w:szCs w:val="20"/>
+              </w:rPr>
+              <w:t xml:space="preserve"> Stage 4 banner, heading </w:t>
+            </w:r>
+            <w:r>
+              <w:rPr>
+                <w:b/>
+                <w:bCs/>
+                <w:color w:val="9B1C1C"/>
                 <w:sz w:val="20"/>
                 <w:szCs w:val="20"/>
               </w:rPr>
@@ -15890,7 +16295,7 @@
                 <w:sz w:val="20"/>
                 <w:szCs w:val="20"/>
               </w:rPr>
-              <w:t xml:space="preserve">Was this good service recovery? Which of the 8 service recovery steps were missing? [box, hint "Write at least 20 characters..."]</w:t>
+              <w:t xml:space="preserve">Was this good service recovery? Which of the 8 service recovery steps were missing? [box, hint "Write at least one full sentence..."]</w:t>
             </w:r>
           </w:p>
           <w:p>
@@ -16335,7 +16740,7 @@
                 <w:sz w:val="20"/>
                 <w:szCs w:val="20"/>
               </w:rPr>
-              <w:t xml:space="preserve">Name ONE item Uniqlo will not accept for return. Why do you think a business would have this rule? [box, hint "Write at least 20 characters..."]</w:t>
+              <w:t xml:space="preserve">Name ONE item Uniqlo will not accept for return. Why do you think a business would have this rule? [box, hint "Write at least one full sentence..."]</w:t>
             </w:r>
           </w:p>
           <w:p>
@@ -16417,7 +16822,25 @@
                 <w:sz w:val="20"/>
                 <w:szCs w:val="20"/>
               </w:rPr>
-              <w:t xml:space="preserve">Badge pop-up for Level 3's badge (name and image to come; a placeholder box until the file is added). Level 4 unlocks.</w:t>
+              <w:t xml:space="preserve">Badge pop-up: </w:t>
+            </w:r>
+            <w:r>
+              <w:rPr>
+                <w:b/>
+                <w:bCs/>
+                <w:color w:val="1F2937"/>
+                <w:sz w:val="20"/>
+                <w:szCs w:val="20"/>
+              </w:rPr>
+              <w:t xml:space="preserve">Service Saver</w:t>
+            </w:r>
+            <w:r>
+              <w:rPr>
+                <w:color w:val="1F2937"/>
+                <w:sz w:val="20"/>
+                <w:szCs w:val="20"/>
+              </w:rPr>
+              <w:t xml:space="preserve"> "You earned the Service Saver badge!" [Back to my route]. Level 4 unlocks.</w:t>
             </w:r>
           </w:p>
         </w:tc>
@@ -16483,7 +16906,7 @@
                 <w:sz w:val="18"/>
                 <w:szCs w:val="18"/>
               </w:rPr>
-              <w:t xml:space="preserve">Returns lines: textbook p. 139, word for word ("a similar product", corrected in version 0.9.0). Saved as s2.think2.</w:t>
+              <w:t xml:space="preserve">Returns lines: textbook p. 139, word for word ("a similar product", corrected in version 0.9.0). Saved as s2.think2. "ONE" is underlined on screen.</w:t>
             </w:r>
           </w:p>
         </w:tc>
@@ -16691,6 +17114,37 @@
             </w:pPr>
             <w:r>
               <w:rPr>
+                <w:color w:val="1F2937"/>
+                <w:sz w:val="20"/>
+                <w:szCs w:val="20"/>
+              </w:rPr>
+              <w:t xml:space="preserve">Level header: [ICON_ALEX] </w:t>
+            </w:r>
+            <w:r>
+              <w:rPr>
+                <w:b/>
+                <w:bCs/>
+                <w:color w:val="1F2937"/>
+                <w:sz w:val="20"/>
+                <w:szCs w:val="20"/>
+              </w:rPr>
+              <w:t xml:space="preserve">Level 4: Chat with Alex</w:t>
+            </w:r>
+            <w:r>
+              <w:rPr>
+                <w:color w:val="1F2937"/>
+                <w:sz w:val="20"/>
+                <w:szCs w:val="20"/>
+              </w:rPr>
+              <w:t xml:space="preserve"> / Be the customer. Chat with Nexora's customer service officer.</w:t>
+            </w:r>
+          </w:p>
+          <w:p>
+            <w:pPr>
+              <w:spacing w:after="60"/>
+            </w:pPr>
+            <w:r>
+              <w:rPr>
                 <w:b/>
                 <w:bCs/>
                 <w:color w:val="9B1C1C"/>
@@ -16868,6 +17322,19 @@
           </w:p>
           <w:p>
             <w:pPr>
+              <w:spacing w:after="60"/>
+            </w:pPr>
+            <w:r>
+              <w:rPr>
+                <w:color w:val="1F2937"/>
+                <w:sz w:val="20"/>
+                <w:szCs w:val="20"/>
+              </w:rPr>
+              <w:t xml:space="preserve">🆕 0.12.0: How to get your chat link: (three numbered steps, each with a numbered circle and an icon, the same in Levels 4, 5 and 6)</w:t>
+            </w:r>
+          </w:p>
+          <w:p>
+            <w:pPr>
               <w:pBdr>
                 <w:left w:val="single" w:color="C9A0AE" w:sz="12" w:space="6"/>
               </w:pBdr>
@@ -16880,7 +17347,75 @@
                 <w:sz w:val="20"/>
                 <w:szCs w:val="20"/>
               </w:rPr>
-              <w:t xml:space="preserve">Use Share in Gemini and copy the conversation link then paste it below. [box, hint "https://gemini.google.com/share/..."]</w:t>
+              <w:t xml:space="preserve">How to get your chat link:</w:t>
+            </w:r>
+          </w:p>
+          <w:p>
+            <w:pPr>
+              <w:pBdr>
+                <w:left w:val="single" w:color="C9A0AE" w:sz="12" w:space="6"/>
+              </w:pBdr>
+              <w:spacing w:after="60"/>
+              <w:ind w:left="160"/>
+            </w:pPr>
+            <w:r>
+              <w:rPr>
+                <w:color w:val="1F2937"/>
+                <w:sz w:val="20"/>
+                <w:szCs w:val="20"/>
+              </w:rPr>
+              <w:t xml:space="preserve">1. 📤 In your Gemini chat, tap Share at the top right.</w:t>
+            </w:r>
+          </w:p>
+          <w:p>
+            <w:pPr>
+              <w:pBdr>
+                <w:left w:val="single" w:color="C9A0AE" w:sz="12" w:space="6"/>
+              </w:pBdr>
+              <w:spacing w:after="60"/>
+              <w:ind w:left="160"/>
+            </w:pPr>
+            <w:r>
+              <w:rPr>
+                <w:color w:val="1F2937"/>
+                <w:sz w:val="20"/>
+                <w:szCs w:val="20"/>
+              </w:rPr>
+              <w:t xml:space="preserve">2. 🔗 Tap Create public link, then tap Copy link.</w:t>
+            </w:r>
+          </w:p>
+          <w:p>
+            <w:pPr>
+              <w:pBdr>
+                <w:left w:val="single" w:color="C9A0AE" w:sz="12" w:space="6"/>
+              </w:pBdr>
+              <w:spacing w:after="60"/>
+              <w:ind w:left="160"/>
+            </w:pPr>
+            <w:r>
+              <w:rPr>
+                <w:color w:val="1F2937"/>
+                <w:sz w:val="20"/>
+                <w:szCs w:val="20"/>
+              </w:rPr>
+              <w:t xml:space="preserve">3. 📋 Come back to this page and paste the link in the box below.</w:t>
+            </w:r>
+          </w:p>
+          <w:p>
+            <w:pPr>
+              <w:pBdr>
+                <w:left w:val="single" w:color="C9A0AE" w:sz="12" w:space="6"/>
+              </w:pBdr>
+              <w:spacing w:after="60"/>
+              <w:ind w:left="160"/>
+            </w:pPr>
+            <w:r>
+              <w:rPr>
+                <w:color w:val="1F2937"/>
+                <w:sz w:val="20"/>
+                <w:szCs w:val="20"/>
+              </w:rPr>
+              <w:t xml:space="preserve">[box, hint "https://gemini.google.com/share/..."]</w:t>
             </w:r>
           </w:p>
           <w:p>
@@ -17068,7 +17603,7 @@
                 <w:sz w:val="18"/>
                 <w:szCs w:val="18"/>
               </w:rPr>
-              <w:t xml:space="preserve">Alex is a Gemini Skill shared as a chat link (Gems are being phased out), set in config.js as GEMS.alex. Tested with a student account on 28 October. The app cannot check the chat itself; the link and the tick box are honesty checks, and the link is saved for the teacher. Alex's instructions and business profile match the app (four stages, objection techniques, after-sales support, the 8 steps).</w:t>
+              <w:t xml:space="preserve">The three share-link steps replace "Use Share in Gemini and copy the conversation link then paste it below." (0.12.0), because the simulations showed this is a multi-step task in another app that G1 students find hard. ⚑ Check the button names (Share, Create public link, Copy link) against Gemini on a Chromebook and an iPad before release. Alex is a Gemini Skill shared as a chat link (Gems are being phased out), set in config.js as GEMS.alex. Tested with a student account on 28 October. The app cannot check the chat itself; the link and the tick box are honesty checks, and the link is saved for the teacher. Alex's instructions and business profile match the app (four stages, objection techniques, after-sales support, the 8 steps).</w:t>
             </w:r>
           </w:p>
         </w:tc>
@@ -17256,7 +17791,7 @@
                 <w:sz w:val="20"/>
                 <w:szCs w:val="20"/>
               </w:rPr>
-              <w:t xml:space="preserve">This is important to customers because [box]</w:t>
+              <w:t xml:space="preserve">This is important to customers because [box] (needs at least one full sentence; the Skill or quality box does not)</w:t>
             </w:r>
           </w:p>
           <w:p>
@@ -17583,7 +18118,7 @@
                 <w:sz w:val="20"/>
                 <w:szCs w:val="20"/>
               </w:rPr>
-              <w:t xml:space="preserve">Not marked; both boxes required. After Submit: "🔎 Check your reason: Does it say how this skill or quality helps the customer? For example, a knowledgeable officer answers questions accurately, so the customer doesn't get wrong information."</w:t>
+              <w:t xml:space="preserve">Not marked; both boxes required. 🆕 0.12.0: If either is missing or the reason is too short, the "Not finished yet" pop-up lists "✗ Q1: Skill or quality" and "✗ Q1: This is important to customers because". After Submit, a self-check prompt in the neutral self-check style (Section C, no ✓ or ✗): "🔎 Self-check: Does it say how this skill or quality helps the customer? For example, a knowledgeable officer answers questions accurately, so the customer doesn't get wrong information."</w:t>
             </w:r>
           </w:p>
         </w:tc>
@@ -17958,6 +18493,37 @@
             </w:pPr>
             <w:r>
               <w:rPr>
+                <w:color w:val="1F2937"/>
+                <w:sz w:val="20"/>
+                <w:szCs w:val="20"/>
+              </w:rPr>
+              <w:t xml:space="preserve">Level header: [ICON_SERVE] </w:t>
+            </w:r>
+            <w:r>
+              <w:rPr>
+                <w:b/>
+                <w:bCs/>
+                <w:color w:val="1F2937"/>
+                <w:sz w:val="20"/>
+                <w:szCs w:val="20"/>
+              </w:rPr>
+              <w:t xml:space="preserve">Level 5: Serve Suzzie at Stylez</w:t>
+            </w:r>
+            <w:r>
+              <w:rPr>
+                <w:color w:val="1F2937"/>
+                <w:sz w:val="20"/>
+                <w:szCs w:val="20"/>
+              </w:rPr>
+              <w:t xml:space="preserve"> / Switch roles. Now you're the customer service officer.</w:t>
+            </w:r>
+          </w:p>
+          <w:p>
+            <w:pPr>
+              <w:spacing w:after="60"/>
+            </w:pPr>
+            <w:r>
+              <w:rPr>
                 <w:b/>
                 <w:bCs/>
                 <w:color w:val="9B1C1C"/>
@@ -18247,7 +18813,7 @@
                 <w:sz w:val="20"/>
                 <w:szCs w:val="20"/>
               </w:rPr>
-              <w:t xml:space="preserve"> (as in 3.1)</w:t>
+              <w:t xml:space="preserve"> with the three steps on how to get the link (as in 4.1)</w:t>
             </w:r>
           </w:p>
           <w:p>
@@ -18493,7 +19059,7 @@
                 <w:sz w:val="20"/>
                 <w:szCs w:val="20"/>
               </w:rPr>
-              <w:t xml:space="preserve">1. Which stages did you do?</w:t>
+              <w:t xml:space="preserve">Q1. Which stages did you do?</w:t>
             </w:r>
             <w:r>
               <w:rPr>
@@ -18528,7 +19094,7 @@
                 <w:sz w:val="20"/>
                 <w:szCs w:val="20"/>
               </w:rPr>
-              <w:t xml:space="preserve">2.</w:t>
+              <w:t xml:space="preserve">Q2.</w:t>
             </w:r>
             <w:r>
               <w:rPr>
@@ -18563,7 +19129,7 @@
                 <w:sz w:val="20"/>
                 <w:szCs w:val="20"/>
               </w:rPr>
-              <w:t xml:space="preserve">3.</w:t>
+              <w:t xml:space="preserve">Q3.</w:t>
             </w:r>
             <w:r>
               <w:rPr>
@@ -18572,6 +19138,19 @@
                 <w:szCs w:val="20"/>
               </w:rPr>
               <w:t xml:space="preserve"> What is one thing you would do differently next time? [box, hint "Next time, I would..."]</w:t>
+            </w:r>
+          </w:p>
+          <w:p>
+            <w:pPr>
+              <w:spacing w:after="60"/>
+            </w:pPr>
+            <w:r>
+              <w:rPr>
+                <w:color w:val="1F2937"/>
+                <w:sz w:val="20"/>
+                <w:szCs w:val="20"/>
+              </w:rPr>
+              <w:t xml:space="preserve">🆕 0.12.0: Questions labelled Q1, Q2 and Q3 (were 1, 2 and 3).</w:t>
             </w:r>
           </w:p>
           <w:p>
@@ -18653,7 +19232,7 @@
                 <w:sz w:val="20"/>
                 <w:szCs w:val="20"/>
               </w:rPr>
-              <w:t xml:space="preserve">Not scored. At least one stage and both boxes required ("Not finished yet" names what is missing). Then 📌 </w:t>
+              <w:t xml:space="preserve">Not scored. At least one stage, and at least one full sentence in each box. 🆕 0.12.0: One "⚠️ Not finished yet" pop-up lists everything missing at once, e.g. "✗ Q1: Choose the stages you used", "✗ Q2", "✗ Q3" (before 0.12.0 it listed Q1 first and the boxes as Box 2 and Box 3 on the next try). Then 📌 </w:t>
             </w:r>
             <w:r>
               <w:rPr>
@@ -18962,6 +19541,37 @@
             </w:pPr>
             <w:r>
               <w:rPr>
+                <w:color w:val="1F2937"/>
+                <w:sz w:val="20"/>
+                <w:szCs w:val="20"/>
+              </w:rPr>
+              <w:t xml:space="preserve">Level header: [ICON_RECOVER] </w:t>
+            </w:r>
+            <w:r>
+              <w:rPr>
+                <w:b/>
+                <w:bCs/>
+                <w:color w:val="1F2937"/>
+                <w:sz w:val="20"/>
+                <w:szCs w:val="20"/>
+              </w:rPr>
+              <w:t xml:space="preserve">Level 6: Win Suzzie Back</w:t>
+            </w:r>
+            <w:r>
+              <w:rPr>
+                <w:color w:val="1F2937"/>
+                <w:sz w:val="20"/>
+                <w:szCs w:val="20"/>
+              </w:rPr>
+              <w:t xml:space="preserve"> / Suzzie is upset. Use the 8 steps to turn her bad experience into a good one.</w:t>
+            </w:r>
+          </w:p>
+          <w:p>
+            <w:pPr>
+              <w:spacing w:after="60"/>
+            </w:pPr>
+            <w:r>
+              <w:rPr>
                 <w:b/>
                 <w:bCs/>
                 <w:color w:val="9B1C1C"/>
@@ -19067,14 +19677,6 @@
               </w:rPr>
               <w:t xml:space="preserve">You are the customer service officer. Suzzie is your customer.</w:t>
             </w:r>
-            <w:r>
-              <w:rPr>
-                <w:color w:val="1F2937"/>
-                <w:sz w:val="20"/>
-                <w:szCs w:val="20"/>
-              </w:rPr>
-              <w:t xml:space="preserve"> In a fresh chat, greet Suzzie to begin. Try: "Hi, welcome to Stylez! How may I assist you?"</w:t>
-            </w:r>
           </w:p>
           <w:p>
             <w:pPr>
@@ -19090,7 +19692,7 @@
                 <w:sz w:val="20"/>
                 <w:szCs w:val="20"/>
               </w:rPr>
-              <w:t xml:space="preserve">[🛍️ Open chat with Suzzie (new tab) ↗]</w:t>
+              <w:t xml:space="preserve">[🛍️ Open chat with angry Suzzie (new tab) ↗]</w:t>
             </w:r>
           </w:p>
           <w:p>
@@ -19183,7 +19785,7 @@
                 <w:sz w:val="20"/>
                 <w:szCs w:val="20"/>
               </w:rPr>
-              <w:t xml:space="preserve"> (as in Levels 4 and 5)</w:t>
+              <w:t xml:space="preserve"> with the three steps on how to get the link (as in 4.1)</w:t>
             </w:r>
           </w:p>
           <w:p>
@@ -19353,7 +19955,7 @@
                 <w:sz w:val="18"/>
                 <w:szCs w:val="18"/>
               </w:rPr>
-              <w:t xml:space="preserve">A second Suzzie chatbot made by the group, where Suzzie is an angry customer (config.js GEMS.suzzieRecovery). It does not replace the Level 5 Suzzie. The intro keeps the problem general so it fits whichever problem the chatbot raises. Level title from the textbook's "win a customer back" (p. 141).</w:t>
+              <w:t xml:space="preserve">A second Suzzie chatbot made by the group, where Suzzie is an angry customer (config.js GEMS.suzzieRecovery). It does not replace the Level 5 Suzzie. The intro keeps the problem general so it fits whichever problem the chatbot raises. The fresh-chat greeting line was removed here in 0.11.9 (Suzzie opens with her complaint), and kept in Level 5 only. Level title from the textbook's "win a customer back" (p. 141).</w:t>
             </w:r>
           </w:p>
         </w:tc>
@@ -19499,7 +20101,7 @@
                 <w:sz w:val="20"/>
                 <w:szCs w:val="20"/>
               </w:rPr>
-              <w:t xml:space="preserve">1. Which of the 8 steps did you use?</w:t>
+              <w:t xml:space="preserve">Q1. Which of the 8 steps did you use?</w:t>
             </w:r>
             <w:r>
               <w:rPr>
@@ -19534,7 +20136,7 @@
                 <w:sz w:val="20"/>
                 <w:szCs w:val="20"/>
               </w:rPr>
-              <w:t xml:space="preserve">2.</w:t>
+              <w:t xml:space="preserve">Q2.</w:t>
             </w:r>
             <w:r>
               <w:rPr>
@@ -19569,7 +20171,7 @@
                 <w:sz w:val="20"/>
                 <w:szCs w:val="20"/>
               </w:rPr>
-              <w:t xml:space="preserve">3.</w:t>
+              <w:t xml:space="preserve">Q3.</w:t>
             </w:r>
             <w:r>
               <w:rPr>
@@ -19578,6 +20180,19 @@
                 <w:szCs w:val="20"/>
               </w:rPr>
               <w:t xml:space="preserve"> What is one thing you would do differently next time? [box, hint "Next time, I would..."]</w:t>
+            </w:r>
+          </w:p>
+          <w:p>
+            <w:pPr>
+              <w:spacing w:after="60"/>
+            </w:pPr>
+            <w:r>
+              <w:rPr>
+                <w:color w:val="1F2937"/>
+                <w:sz w:val="20"/>
+                <w:szCs w:val="20"/>
+              </w:rPr>
+              <w:t xml:space="preserve">🆕 0.12.0: Questions labelled Q1, Q2 and Q3 (were 1, 2 and 3).</w:t>
             </w:r>
           </w:p>
           <w:p>
@@ -19659,7 +20274,7 @@
                 <w:sz w:val="20"/>
                 <w:szCs w:val="20"/>
               </w:rPr>
-              <w:t xml:space="preserve">Not scored. At least one step and both boxes required ("Not finished yet" names what is missing). Then 📌 </w:t>
+              <w:t xml:space="preserve">Not scored. At least one step, and at least one full sentence in each box. 🆕 0.12.0: One "⚠️ Not finished yet" pop-up lists everything missing at once: "✗ Q1: Choose the steps you used", "✗ Q2", "✗ Q3" (never "Box 2" or "Box 3"). Then 📌 </w:t>
             </w:r>
             <w:r>
               <w:rPr>
@@ -19965,6 +20580,37 @@
           </w:tcPr>
           <w:p>
             <w:pPr>
+              <w:spacing w:after="60"/>
+            </w:pPr>
+            <w:r>
+              <w:rPr>
+                <w:color w:val="1F2937"/>
+                <w:sz w:val="20"/>
+                <w:szCs w:val="20"/>
+              </w:rPr>
+              <w:t xml:space="preserve">Level header: [ICON_CHECK] </w:t>
+            </w:r>
+            <w:r>
+              <w:rPr>
+                <w:b/>
+                <w:bCs/>
+                <w:color w:val="1F2937"/>
+                <w:sz w:val="20"/>
+                <w:szCs w:val="20"/>
+              </w:rPr>
+              <w:t xml:space="preserve">Level 7: Check and Exit Ticket</w:t>
+            </w:r>
+            <w:r>
+              <w:rPr>
+                <w:color w:val="1F2937"/>
+                <w:sz w:val="20"/>
+                <w:szCs w:val="20"/>
+              </w:rPr>
+              <w:t xml:space="preserve"> / Check what you've learnt and tell your teacher how confident you feel.</w:t>
+            </w:r>
+          </w:p>
+          <w:p>
+            <w:pPr>
               <w:pBdr>
                 <w:left w:val="single" w:color="C9A0AE" w:sz="12" w:space="6"/>
               </w:pBdr>
@@ -20211,7 +20857,7 @@
                 <w:sz w:val="20"/>
                 <w:szCs w:val="20"/>
               </w:rPr>
-              <w:t xml:space="preserve">Quality customer service matters because [box]</w:t>
+              <w:t xml:space="preserve">Quality customer service matters because [box] (at least one full sentence)</w:t>
             </w:r>
           </w:p>
           <w:p>
@@ -20448,7 +21094,7 @@
                 <w:sz w:val="20"/>
                 <w:szCs w:val="20"/>
               </w:rPr>
-              <w:t xml:space="preserve">Not marked; required. After Check answer: "🔎 Check your answer: Did you name one reason (customers return repeatedly, customers recommend the business to their relatives and friends, or customer loyalty ensures the continuity of the business) and explain what it means for the business?"</w:t>
+              <w:t xml:space="preserve">Not marked; required (at least one full sentence). 🆕 0.12.0: After Check answer, a self-check prompt in the neutral self-check style (Section C, no ✓ or ✗): "🔎 Self-check: Did you name one reason (customers return repeatedly, customers recommend the business to their relatives and friends, or customer loyalty ensures the continuity of the business) and explain what it means for the business?"</w:t>
             </w:r>
           </w:p>
         </w:tc>
@@ -20867,7 +21513,7 @@
                 <w:sz w:val="20"/>
                 <w:szCs w:val="20"/>
               </w:rPr>
-              <w:t xml:space="preserve">All fields required ("Not finished yet" names what is missing). Not scored.</w:t>
+              <w:t xml:space="preserve">All fields required; Q4 and Q5 need at least one full sentence each. 🆕 0.12.0: One "⚠️ Not finished yet" pop-up lists everything missing at once, e.g. "✗ Q4", "✗ Q5", "✗ Q6 (row 1)" (the labels already match the screen). Not scored.</w:t>
             </w:r>
           </w:p>
         </w:tc>
@@ -21210,7 +21856,7 @@
                 <w:sz w:val="20"/>
                 <w:szCs w:val="20"/>
               </w:rPr>
-              <w:t xml:space="preserve">: one line per item wrong on the first try, e.g. "Closing the customer experience positively (Level 2, The four stages)". Before Levels 4 and 7 are done: "Finish Levels 4 and 7 to see what to look at again." All right: "Nothing to look at again. You got everything right on the first try! 🎉"</w:t>
+              <w:t xml:space="preserve">: one line per item wrong on the first try, e.g. "Closing the customer experience positively (Level 3, Stage 3: Closing the customer experience positively)". 🆕 0.12.0: The three Level 4 Q2 pointers that went to the one-line overview (Level 2, The four stages) now go to the card where each topic is taught: line Q "Presenting product information (Level 2, Stage 2: Presenting product information)"; line R "Closing the customer experience positively (Level 3, Stage 3: Closing the customer experience positively)"; line S "Approaching customers (Level 2, Stage 1: Approaching customers)". The other pointers already go to the right card and are unchanged. Before Levels 4 and 7 are done: "Finish Levels 4 and 7 to see what to look at again." All right: "Nothing to look at again. You got everything right on the first try! 🎉"</w:t>
             </w:r>
           </w:p>
           <w:p>
@@ -21256,7 +21902,7 @@
                 <w:sz w:val="20"/>
                 <w:szCs w:val="20"/>
               </w:rPr>
-              <w:t xml:space="preserve">: "These are your saved answers. Questions you have not answered are marked "Not answered yet"." Then every answer, level by level, with first and second tries for marked questions ("Not needed: Right on the first try" where it applies).</w:t>
+              <w:t xml:space="preserve">: "These are your saved answers. Questions you have not answered are marked "Not answered yet"." Then every answer, level by level, with the same question labels as on screen (Q1, Q2, …), with first and second tries for marked questions ("Not needed: Right on the first try" where it applies).</w:t>
             </w:r>
           </w:p>
           <w:p>
@@ -21708,7 +22354,7 @@
                 <w:sz w:val="20"/>
                 <w:szCs w:val="20"/>
               </w:rPr>
-              <w:t xml:space="preserve">Each Level button opens a preview with every card and tab open: "Teacher preview: all sections are open. Activities are view-only and do not change student progress." [Back to Teacher Mode]</w:t>
+              <w:t xml:space="preserve">Each Level button opens a preview laid out like the student pages (Levels 2 and 3 one card at a time with Back and Next and the progress line; other levels with their step tabs and Continue), with every card and tab unlocked: "Teacher preview: all sections are accessible. Activities are view-only and do not change student progress." [Back to Teacher Mode], and links to the other levels. Home from a preview returns to Teacher Mode.</w:t>
             </w:r>
           </w:p>
         </w:tc>
@@ -22954,7 +23600,7 @@
                 <w:sz w:val="19"/>
                 <w:szCs w:val="19"/>
               </w:rPr>
-              <w:t xml:space="preserve">TERM_SERVICE, TERM_QUALITY, TERM_BREAKDOWN, TERM_RECOVERY</w:t>
+              <w:t xml:space="preserve">ICON_STORIES, ICON_ALEX, ICON_SERVE, ICON_RECOVER, ICON_CHECK</w:t>
             </w:r>
           </w:p>
         </w:tc>
@@ -22981,7 +23627,7 @@
                 <w:sz w:val="19"/>
                 <w:szCs w:val="19"/>
               </w:rPr>
-              <w:t xml:space="preserve">term-customer-service.png and three more</w:t>
+              <w:t xml:space="preserve">icon-level-{stories, alex, serve, recover, check}.png</w:t>
             </w:r>
           </w:p>
         </w:tc>
@@ -23008,7 +23654,7 @@
                 <w:sz w:val="19"/>
                 <w:szCs w:val="19"/>
               </w:rPr>
-              <w:t xml:space="preserve">Key term cards and definition boxes</w:t>
+              <w:t xml:space="preserve">Level icons for Levels 1, 4, 5, 6 and 7 (home route and level headers)</w:t>
             </w:r>
           </w:p>
         </w:tc>
@@ -23037,7 +23683,7 @@
                 <w:sz w:val="19"/>
                 <w:szCs w:val="19"/>
               </w:rPr>
-              <w:t xml:space="preserve">C01</w:t>
+              <w:t xml:space="preserve">STAGE1_BANNER to STAGE4_BANNER</w:t>
             </w:r>
           </w:p>
         </w:tc>
@@ -23064,7 +23710,7 @@
                 <w:sz w:val="19"/>
                 <w:szCs w:val="19"/>
               </w:rPr>
-              <w:t xml:space="preserve">C01-good-vs-poor-service-v2.jpg</w:t>
+              <w:t xml:space="preserve">stage-1-approaching-banner.jpg, stage-2-banner.jpg, stage-3-banner.jpg, stage-4-banner.jpg</w:t>
             </w:r>
           </w:p>
         </w:tc>
@@ -23091,7 +23737,7 @@
                 <w:sz w:val="19"/>
                 <w:szCs w:val="19"/>
               </w:rPr>
-              <w:t xml:space="preserve">Level 2, card 3</w:t>
+              <w:t xml:space="preserve">Top of every stage card: Level 2 cards 7 and 10 to 12; Level 3 cards 1, 2, 3 and 5</w:t>
             </w:r>
           </w:p>
         </w:tc>
@@ -23120,7 +23766,7 @@
                 <w:sz w:val="19"/>
                 <w:szCs w:val="19"/>
               </w:rPr>
-              <w:t xml:space="preserve">PK_FEATURES to PK_SELLING_POINT</w:t>
+              <w:t xml:space="preserve">TERM_SERVICE, TERM_QUALITY, TERM_BREAKDOWN, TERM_RECOVERY</w:t>
             </w:r>
           </w:p>
         </w:tc>
@@ -23147,7 +23793,7 @@
                 <w:sz w:val="19"/>
                 <w:szCs w:val="19"/>
               </w:rPr>
-              <w:t xml:space="preserve">product-knowledge-{features, price, care, warranty, selling-point}-v2.jpg</w:t>
+              <w:t xml:space="preserve">term-customer-service.png and three more</w:t>
             </w:r>
           </w:p>
         </w:tc>
@@ -23174,7 +23820,7 @@
                 <w:sz w:val="19"/>
                 <w:szCs w:val="19"/>
               </w:rPr>
-              <w:t xml:space="preserve">Level 2, card 5 (900 × 900, re-lettered speech bubbles)</w:t>
+              <w:t xml:space="preserve">Key term cards and definition boxes</w:t>
             </w:r>
           </w:p>
         </w:tc>
@@ -23203,7 +23849,7 @@
                 <w:sz w:val="19"/>
                 <w:szCs w:val="19"/>
               </w:rPr>
-              <w:t xml:space="preserve">C02</w:t>
+              <w:t xml:space="preserve">C01</w:t>
             </w:r>
           </w:p>
         </w:tc>
@@ -23230,7 +23876,7 @@
                 <w:sz w:val="19"/>
                 <w:szCs w:val="19"/>
               </w:rPr>
-              <w:t xml:space="preserve">C02-four-stages-v2.jpg</w:t>
+              <w:t xml:space="preserve">C01-good-vs-poor-service-v2.jpg</w:t>
             </w:r>
           </w:p>
         </w:tc>
@@ -23257,7 +23903,7 @@
                 <w:sz w:val="19"/>
                 <w:szCs w:val="19"/>
               </w:rPr>
-              <w:t xml:space="preserve">Level 2, card 6</w:t>
+              <w:t xml:space="preserve">Level 2, card 3</w:t>
             </w:r>
           </w:p>
         </w:tc>
@@ -23286,7 +23932,7 @@
                 <w:sz w:val="19"/>
                 <w:szCs w:val="19"/>
               </w:rPr>
-              <w:t xml:space="preserve">C03</w:t>
+              <w:t xml:space="preserve">PK_FEATURES to PK_SELLING_POINT</w:t>
             </w:r>
           </w:p>
         </w:tc>
@@ -23313,7 +23959,7 @@
                 <w:sz w:val="19"/>
                 <w:szCs w:val="19"/>
               </w:rPr>
-              <w:t xml:space="preserve">C03-three-approaches-v2.jpg</w:t>
+              <w:t xml:space="preserve">product-knowledge-{features, price, care, warranty, selling-point}-v2.jpg</w:t>
             </w:r>
           </w:p>
         </w:tc>
@@ -23340,7 +23986,7 @@
                 <w:sz w:val="19"/>
                 <w:szCs w:val="19"/>
               </w:rPr>
-              <w:t xml:space="preserve">Level 2, card 7</w:t>
+              <w:t xml:space="preserve">Level 2, card 5 (900 × 900, re-lettered speech bubbles)</w:t>
             </w:r>
           </w:p>
         </w:tc>
@@ -23369,7 +24015,7 @@
                 <w:sz w:val="19"/>
                 <w:szCs w:val="19"/>
               </w:rPr>
-              <w:t xml:space="preserve">SUITABILITY</w:t>
+              <w:t xml:space="preserve">C02</w:t>
             </w:r>
           </w:p>
         </w:tc>
@@ -23396,7 +24042,7 @@
                 <w:sz w:val="19"/>
                 <w:szCs w:val="19"/>
               </w:rPr>
-              <w:t xml:space="preserve">product-suitability-camera.png</w:t>
+              <w:t xml:space="preserve">C02-four-stages-v2.jpg</w:t>
             </w:r>
           </w:p>
         </w:tc>
@@ -23423,7 +24069,7 @@
                 <w:sz w:val="19"/>
                 <w:szCs w:val="19"/>
               </w:rPr>
-              <w:t xml:space="preserve">Level 2, card 11</w:t>
+              <w:t xml:space="preserve">Level 2, card 6</w:t>
             </w:r>
           </w:p>
         </w:tc>
@@ -23452,7 +24098,7 @@
                 <w:sz w:val="19"/>
                 <w:szCs w:val="19"/>
               </w:rPr>
-              <w:t xml:space="preserve">C04</w:t>
+              <w:t xml:space="preserve">C03</w:t>
             </w:r>
           </w:p>
         </w:tc>
@@ -23479,7 +24125,7 @@
                 <w:sz w:val="19"/>
                 <w:szCs w:val="19"/>
               </w:rPr>
-              <w:t xml:space="preserve">C04-breakdown-to-recovery-v2.jpg</w:t>
+              <w:t xml:space="preserve">C03-three-approaches-v2.jpg</w:t>
             </w:r>
           </w:p>
         </w:tc>
@@ -23506,7 +24152,7 @@
                 <w:sz w:val="19"/>
                 <w:szCs w:val="19"/>
               </w:rPr>
-              <w:t xml:space="preserve">Level 3, card 3</w:t>
+              <w:t xml:space="preserve">Level 2, card 7</w:t>
             </w:r>
           </w:p>
         </w:tc>
@@ -23535,7 +24181,7 @@
                 <w:sz w:val="19"/>
                 <w:szCs w:val="19"/>
               </w:rPr>
-              <w:t xml:space="preserve">C05</w:t>
+              <w:t xml:space="preserve">SUITABILITY</w:t>
             </w:r>
           </w:p>
         </w:tc>
@@ -23562,7 +24208,7 @@
                 <w:sz w:val="19"/>
                 <w:szCs w:val="19"/>
               </w:rPr>
-              <w:t xml:space="preserve">C05-customer-service-timeline.jpg</w:t>
+              <w:t xml:space="preserve">product-suitability-camera.png</w:t>
             </w:r>
           </w:p>
         </w:tc>
@@ -23589,7 +24235,7 @@
                 <w:sz w:val="19"/>
                 <w:szCs w:val="19"/>
               </w:rPr>
-              <w:t xml:space="preserve">Level 2, card 2</w:t>
+              <w:t xml:space="preserve">Level 2, card 11</w:t>
             </w:r>
           </w:p>
         </w:tc>
@@ -23618,7 +24264,7 @@
                 <w:sz w:val="19"/>
                 <w:szCs w:val="19"/>
               </w:rPr>
-              <w:t xml:space="preserve">C06</w:t>
+              <w:t xml:space="preserve">C04</w:t>
             </w:r>
           </w:p>
         </w:tc>
@@ -23645,7 +24291,7 @@
                 <w:sz w:val="19"/>
                 <w:szCs w:val="19"/>
               </w:rPr>
-              <w:t xml:space="preserve">C06-handling-objections.jpg</w:t>
+              <w:t xml:space="preserve">C04-breakdown-to-recovery-v2.jpg</w:t>
             </w:r>
           </w:p>
         </w:tc>
@@ -23672,7 +24318,7 @@
                 <w:sz w:val="19"/>
                 <w:szCs w:val="19"/>
               </w:rPr>
-              <w:t xml:space="preserve">Level 2, card 12</w:t>
+              <w:t xml:space="preserve">Level 3, card 3</w:t>
             </w:r>
           </w:p>
         </w:tc>
@@ -23701,7 +24347,7 @@
                 <w:sz w:val="19"/>
                 <w:szCs w:val="19"/>
               </w:rPr>
-              <w:t xml:space="preserve">C07</w:t>
+              <w:t xml:space="preserve">C05</w:t>
             </w:r>
           </w:p>
         </w:tc>
@@ -23728,7 +24374,7 @@
                 <w:sz w:val="19"/>
                 <w:szCs w:val="19"/>
               </w:rPr>
-              <w:t xml:space="preserve">C07-closing-positively.jpg</w:t>
+              <w:t xml:space="preserve">C05-customer-service-timeline.jpg</w:t>
             </w:r>
           </w:p>
         </w:tc>
@@ -23755,7 +24401,7 @@
                 <w:sz w:val="19"/>
                 <w:szCs w:val="19"/>
               </w:rPr>
-              <w:t xml:space="preserve">Level 3, card 1</w:t>
+              <w:t xml:space="preserve">Level 2, card 2</w:t>
             </w:r>
           </w:p>
         </w:tc>
@@ -23784,7 +24430,7 @@
                 <w:sz w:val="19"/>
                 <w:szCs w:val="19"/>
               </w:rPr>
-              <w:t xml:space="preserve">R01, R02</w:t>
+              <w:t xml:space="preserve">C06</w:t>
             </w:r>
           </w:p>
         </w:tc>
@@ -23811,7 +24457,7 @@
                 <w:sz w:val="19"/>
                 <w:szCs w:val="19"/>
               </w:rPr>
-              <w:t xml:space="preserve">R01-foodpanda-chat.jpg, R02-foodpanda-voucher.jpg</w:t>
+              <w:t xml:space="preserve">C06-handling-objections-v2.jpg</w:t>
             </w:r>
           </w:p>
         </w:tc>
@@ -23838,7 +24484,7 @@
                 <w:sz w:val="19"/>
                 <w:szCs w:val="19"/>
               </w:rPr>
-              <w:t xml:space="preserve">Level 3, card 6</w:t>
+              <w:t xml:space="preserve">Level 2, card 12</w:t>
             </w:r>
           </w:p>
         </w:tc>
@@ -23867,7 +24513,7 @@
                 <w:sz w:val="19"/>
                 <w:szCs w:val="19"/>
               </w:rPr>
-              <w:t xml:space="preserve">N03</w:t>
+              <w:t xml:space="preserve">C07</w:t>
             </w:r>
           </w:p>
         </w:tc>
@@ -23894,7 +24540,7 @@
                 <w:sz w:val="19"/>
                 <w:szCs w:val="19"/>
               </w:rPr>
-              <w:t xml:space="preserve">N03-returns-v2.jpg</w:t>
+              <w:t xml:space="preserve">C07-closing-positively-v2.jpg</w:t>
             </w:r>
           </w:p>
         </w:tc>
@@ -23921,7 +24567,7 @@
                 <w:sz w:val="19"/>
                 <w:szCs w:val="19"/>
               </w:rPr>
-              <w:t xml:space="preserve">Level 3, card 7</w:t>
+              <w:t xml:space="preserve">Level 3, card 1</w:t>
             </w:r>
           </w:p>
         </w:tc>
@@ -23950,7 +24596,7 @@
                 <w:sz w:val="19"/>
                 <w:szCs w:val="19"/>
               </w:rPr>
-              <w:t xml:space="preserve">R03</w:t>
+              <w:t xml:space="preserve">R01, R02</w:t>
             </w:r>
           </w:p>
         </w:tc>
@@ -23977,7 +24623,7 @@
                 <w:sz w:val="19"/>
                 <w:szCs w:val="19"/>
               </w:rPr>
-              <w:t xml:space="preserve">R03-uniqlo-returns.jpg</w:t>
+              <w:t xml:space="preserve">R01-foodpanda-chat.jpg, R02-foodpanda-voucher.jpg</w:t>
             </w:r>
           </w:p>
         </w:tc>
@@ -24004,7 +24650,7 @@
                 <w:sz w:val="19"/>
                 <w:szCs w:val="19"/>
               </w:rPr>
-              <w:t xml:space="preserve">Level 3, card 7</w:t>
+              <w:t xml:space="preserve">Level 3, card 6</w:t>
             </w:r>
           </w:p>
         </w:tc>
@@ -24033,7 +24679,7 @@
                 <w:sz w:val="19"/>
                 <w:szCs w:val="19"/>
               </w:rPr>
-              <w:t xml:space="preserve">N04, N05</w:t>
+              <w:t xml:space="preserve">N03</w:t>
             </w:r>
           </w:p>
         </w:tc>
@@ -24060,7 +24706,7 @@
                 <w:sz w:val="19"/>
                 <w:szCs w:val="19"/>
               </w:rPr>
-              <w:t xml:space="preserve">N04-alex.jpg, N05-suzzie.jpg</w:t>
+              <w:t xml:space="preserve">N03-returns-v2.jpg</w:t>
             </w:r>
           </w:p>
         </w:tc>
@@ -24087,7 +24733,7 @@
                 <w:sz w:val="19"/>
                 <w:szCs w:val="19"/>
               </w:rPr>
-              <w:t xml:space="preserve">Level 4; Levels 5 and 6</w:t>
+              <w:t xml:space="preserve">Level 3, card 7</w:t>
             </w:r>
           </w:p>
         </w:tc>
@@ -24116,7 +24762,7 @@
                 <w:sz w:val="19"/>
                 <w:szCs w:val="19"/>
               </w:rPr>
-              <w:t xml:space="preserve">Seven badges</w:t>
+              <w:t xml:space="preserve">R03</w:t>
             </w:r>
           </w:p>
         </w:tc>
@@ -24143,7 +24789,173 @@
                 <w:sz w:val="19"/>
                 <w:szCs w:val="19"/>
               </w:rPr>
-              <w:t xml:space="preserve">badge-story-sharer-vibrant.png (1), badge-service-scholar-vibrant.png (2), Level 3 badge to come (placeholder box), badge-service-spotter-vibrant.png (4), badge-service-star-vibrant.png (5), badge-service-superstar.png (6), badge-completion-champion.png (7)</w:t>
+              <w:t xml:space="preserve">R03-uniqlo-returns.jpg</w:t>
+            </w:r>
+          </w:p>
+        </w:tc>
+        <w:tc>
+          <w:tcPr>
+            <w:tcW w:type="dxa" w:w="3465"/>
+            <w:tcBorders>
+              <w:top w:val="single" w:color="E8DADF" w:sz="4"/>
+              <w:left w:val="single" w:color="E8DADF" w:sz="4"/>
+              <w:bottom w:val="single" w:color="E8DADF" w:sz="4"/>
+              <w:right w:val="single" w:color="E8DADF" w:sz="4"/>
+            </w:tcBorders>
+            <w:tcMar>
+              <w:top w:type="dxa" w:w="80"/>
+              <w:left w:type="dxa" w:w="120"/>
+              <w:bottom w:type="dxa" w:w="80"/>
+              <w:right w:type="dxa" w:w="120"/>
+            </w:tcMar>
+          </w:tcPr>
+          <w:p>
+            <w:r>
+              <w:rPr>
+                <w:color w:val="1F2937"/>
+                <w:sz w:val="19"/>
+                <w:szCs w:val="19"/>
+              </w:rPr>
+              <w:t xml:space="preserve">Level 3, card 7</w:t>
+            </w:r>
+          </w:p>
+        </w:tc>
+      </w:tr>
+      <w:tr>
+        <w:tc>
+          <w:tcPr>
+            <w:tcW w:type="dxa" w:w="1782"/>
+            <w:tcBorders>
+              <w:top w:val="single" w:color="E8DADF" w:sz="4"/>
+              <w:left w:val="single" w:color="E8DADF" w:sz="4"/>
+              <w:bottom w:val="single" w:color="E8DADF" w:sz="4"/>
+              <w:right w:val="single" w:color="E8DADF" w:sz="4"/>
+            </w:tcBorders>
+            <w:tcMar>
+              <w:top w:type="dxa" w:w="80"/>
+              <w:left w:type="dxa" w:w="120"/>
+              <w:bottom w:type="dxa" w:w="80"/>
+              <w:right w:type="dxa" w:w="120"/>
+            </w:tcMar>
+          </w:tcPr>
+          <w:p>
+            <w:r>
+              <w:rPr>
+                <w:color w:val="1F2937"/>
+                <w:sz w:val="19"/>
+                <w:szCs w:val="19"/>
+              </w:rPr>
+              <w:t xml:space="preserve">N04, N05</w:t>
+            </w:r>
+          </w:p>
+        </w:tc>
+        <w:tc>
+          <w:tcPr>
+            <w:tcW w:type="dxa" w:w="4653"/>
+            <w:tcBorders>
+              <w:top w:val="single" w:color="E8DADF" w:sz="4"/>
+              <w:left w:val="single" w:color="E8DADF" w:sz="4"/>
+              <w:bottom w:val="single" w:color="E8DADF" w:sz="4"/>
+              <w:right w:val="single" w:color="E8DADF" w:sz="4"/>
+            </w:tcBorders>
+            <w:tcMar>
+              <w:top w:type="dxa" w:w="80"/>
+              <w:left w:type="dxa" w:w="120"/>
+              <w:bottom w:type="dxa" w:w="80"/>
+              <w:right w:type="dxa" w:w="120"/>
+            </w:tcMar>
+          </w:tcPr>
+          <w:p>
+            <w:r>
+              <w:rPr>
+                <w:color w:val="1F2937"/>
+                <w:sz w:val="19"/>
+                <w:szCs w:val="19"/>
+              </w:rPr>
+              <w:t xml:space="preserve">N04-alex.jpg, N05-suzzie.jpg</w:t>
+            </w:r>
+          </w:p>
+        </w:tc>
+        <w:tc>
+          <w:tcPr>
+            <w:tcW w:type="dxa" w:w="3465"/>
+            <w:tcBorders>
+              <w:top w:val="single" w:color="E8DADF" w:sz="4"/>
+              <w:left w:val="single" w:color="E8DADF" w:sz="4"/>
+              <w:bottom w:val="single" w:color="E8DADF" w:sz="4"/>
+              <w:right w:val="single" w:color="E8DADF" w:sz="4"/>
+            </w:tcBorders>
+            <w:tcMar>
+              <w:top w:type="dxa" w:w="80"/>
+              <w:left w:type="dxa" w:w="120"/>
+              <w:bottom w:type="dxa" w:w="80"/>
+              <w:right w:type="dxa" w:w="120"/>
+            </w:tcMar>
+          </w:tcPr>
+          <w:p>
+            <w:r>
+              <w:rPr>
+                <w:color w:val="1F2937"/>
+                <w:sz w:val="19"/>
+                <w:szCs w:val="19"/>
+              </w:rPr>
+              <w:t xml:space="preserve">Level 4; Levels 5 and 6</w:t>
+            </w:r>
+          </w:p>
+        </w:tc>
+      </w:tr>
+      <w:tr>
+        <w:tc>
+          <w:tcPr>
+            <w:tcW w:type="dxa" w:w="1782"/>
+            <w:tcBorders>
+              <w:top w:val="single" w:color="E8DADF" w:sz="4"/>
+              <w:left w:val="single" w:color="E8DADF" w:sz="4"/>
+              <w:bottom w:val="single" w:color="E8DADF" w:sz="4"/>
+              <w:right w:val="single" w:color="E8DADF" w:sz="4"/>
+            </w:tcBorders>
+            <w:tcMar>
+              <w:top w:type="dxa" w:w="80"/>
+              <w:left w:type="dxa" w:w="120"/>
+              <w:bottom w:type="dxa" w:w="80"/>
+              <w:right w:type="dxa" w:w="120"/>
+            </w:tcMar>
+          </w:tcPr>
+          <w:p>
+            <w:r>
+              <w:rPr>
+                <w:color w:val="1F2937"/>
+                <w:sz w:val="19"/>
+                <w:szCs w:val="19"/>
+              </w:rPr>
+              <w:t xml:space="preserve">Seven badges</w:t>
+            </w:r>
+          </w:p>
+        </w:tc>
+        <w:tc>
+          <w:tcPr>
+            <w:tcW w:type="dxa" w:w="4653"/>
+            <w:tcBorders>
+              <w:top w:val="single" w:color="E8DADF" w:sz="4"/>
+              <w:left w:val="single" w:color="E8DADF" w:sz="4"/>
+              <w:bottom w:val="single" w:color="E8DADF" w:sz="4"/>
+              <w:right w:val="single" w:color="E8DADF" w:sz="4"/>
+            </w:tcBorders>
+            <w:tcMar>
+              <w:top w:type="dxa" w:w="80"/>
+              <w:left w:type="dxa" w:w="120"/>
+              <w:bottom w:type="dxa" w:w="80"/>
+              <w:right w:type="dxa" w:w="120"/>
+            </w:tcMar>
+          </w:tcPr>
+          <w:p>
+            <w:r>
+              <w:rPr>
+                <w:color w:val="1F2937"/>
+                <w:sz w:val="19"/>
+                <w:szCs w:val="19"/>
+              </w:rPr>
+              <w:t xml:space="preserve">badge-story-sharer-vibrant.png (1), badge-service-scholar-vibrant.png (2), badge-service-saver.png (3), badge-service-spotter-vibrant.png (4), badge-service-star-vibrant.png (5), badge-service-superstar.png (6), badge-completion-champion.png (7)</w:t>
             </w:r>
           </w:p>
         </w:tc>
@@ -24322,6 +25134,123 @@
         <w:spacing w:after="100" w:before="200"/>
       </w:pPr>
       <w:r>
+        <w:t xml:space="preserve">Alt text for the stage banners and level icons</w:t>
+      </w:r>
+    </w:p>
+    <w:p>
+      <w:pPr>
+        <w:pStyle w:val="ListParagraph"/>
+        <w:numPr>
+          <w:ilvl w:val="0"/>
+          <w:numId w:val="2"/>
+        </w:numPr>
+        <w:spacing w:after="60"/>
+      </w:pPr>
+      <w:r>
+        <w:rPr>
+          <w:color w:val="1F2937"/>
+          <w:sz w:val="20"/>
+          <w:szCs w:val="20"/>
+        </w:rPr>
+        <w:t xml:space="preserve">STAGE1_BANNER: Stage 1: Approaching customers. A smiling Nexora staff member welcomes a customer with a friendly wave.</w:t>
+      </w:r>
+    </w:p>
+    <w:p>
+      <w:pPr>
+        <w:pStyle w:val="ListParagraph"/>
+        <w:numPr>
+          <w:ilvl w:val="0"/>
+          <w:numId w:val="2"/>
+        </w:numPr>
+        <w:spacing w:after="60"/>
+      </w:pPr>
+      <w:r>
+        <w:rPr>
+          <w:color w:val="1F2937"/>
+          <w:sz w:val="20"/>
+          <w:szCs w:val="20"/>
+        </w:rPr>
+        <w:t xml:space="preserve">STAGE2_BANNER: Stage 2: Presenting product information. The Nexora staff member helps the customer in the phone shop.</w:t>
+      </w:r>
+    </w:p>
+    <w:p>
+      <w:pPr>
+        <w:pStyle w:val="ListParagraph"/>
+        <w:numPr>
+          <w:ilvl w:val="0"/>
+          <w:numId w:val="2"/>
+        </w:numPr>
+        <w:spacing w:after="60"/>
+      </w:pPr>
+      <w:r>
+        <w:rPr>
+          <w:color w:val="1F2937"/>
+          <w:sz w:val="20"/>
+          <w:szCs w:val="20"/>
+        </w:rPr>
+        <w:t xml:space="preserve">STAGE3_BANNER: Stage 3: Closing the customer experience positively. The Nexora staff member helps the customer in the phone shop.</w:t>
+      </w:r>
+    </w:p>
+    <w:p>
+      <w:pPr>
+        <w:pStyle w:val="ListParagraph"/>
+        <w:numPr>
+          <w:ilvl w:val="0"/>
+          <w:numId w:val="2"/>
+        </w:numPr>
+        <w:spacing w:after="60"/>
+      </w:pPr>
+      <w:r>
+        <w:rPr>
+          <w:color w:val="1F2937"/>
+          <w:sz w:val="20"/>
+          <w:szCs w:val="20"/>
+        </w:rPr>
+        <w:t xml:space="preserve">STAGE4_BANNER: Stage 4: Performing service recovery. The Nexora staff member helps the customer in the phone shop.</w:t>
+      </w:r>
+    </w:p>
+    <w:p>
+      <w:pPr>
+        <w:pStyle w:val="ListParagraph"/>
+        <w:numPr>
+          <w:ilvl w:val="0"/>
+          <w:numId w:val="2"/>
+        </w:numPr>
+        <w:spacing w:after="60"/>
+      </w:pPr>
+      <w:r>
+        <w:rPr>
+          <w:color w:val="1F2937"/>
+          <w:sz w:val="20"/>
+          <w:szCs w:val="20"/>
+        </w:rPr>
+        <w:t xml:space="preserve">Level icons: Stories notebook and speech bubble (Level 1); Customer service headset and chat bubbles (Level 4); Shopping bag and friendly service bell (Level 5); Recovery arrows, heart and repair tool (Level 6); Checklist and pencil (Level 7).</w:t>
+      </w:r>
+    </w:p>
+    <w:p>
+      <w:pPr>
+        <w:pStyle w:val="ListParagraph"/>
+        <w:numPr>
+          <w:ilvl w:val="0"/>
+          <w:numId w:val="2"/>
+        </w:numPr>
+        <w:spacing w:after="60"/>
+      </w:pPr>
+      <w:r>
+        <w:rPr>
+          <w:color w:val="1F2937"/>
+          <w:sz w:val="20"/>
+          <w:szCs w:val="20"/>
+        </w:rPr>
+        <w:t xml:space="preserve">Service Saver badge: Service Saver badge (gold medallion with a teal rim, a green shield and a helping hand).</w:t>
+      </w:r>
+    </w:p>
+    <w:p>
+      <w:pPr>
+        <w:pStyle w:val="Heading3"/>
+        <w:spacing w:after="100" w:before="200"/>
+      </w:pPr>
+      <w:r>
         <w:t xml:space="preserve">Videos</w:t>
       </w:r>
     </w:p>
@@ -24421,7 +25350,7 @@
           <w:sz w:val="20"/>
           <w:szCs w:val="20"/>
         </w:rPr>
-        <w:t xml:space="preserve">C06: Four-panel comic at a Nexora store. 1, SELLING POINT: The customer, holding a phone: "This phone is a bit heavy." "Hmm… I'm not so sure if I should get this." The staff member: "It's heavier because it has a bigger battery, so it lasts the whole day." 2, YES, BUT: Beside a $1,299 price tag, the customer: "The Nexora Prime is expensive." The staff member: "Yes, it costs more, but its fast processor runs your games smoothly." 3, SHARE CONCERNS: The customer: "Hmm… I'm not so sure if I should get this." The staff member: "What worries you most about switching to a new phone?" 4, CORRECT MISCONCEPTION: The customer: "So the warranty covers everything, right?" The staff member, holding a warranty card: "Good question! The warranty covers manufacturing defects. Accidental damage, such as dropping the phone, isn't covered."</w:t>
+        <w:t xml:space="preserve">C06 (v2): Four-panel comic at a Nexora store. 1, SELLING POINT: The customer, holding a phone: "This phone is a bit heavy." The staff member: "It's heavier because it has a bigger battery, so it lasts the whole day." 2, YES, BUT: Beside a $1,299 price tag, the customer: "The Nexora Prime is expensive." The staff member: "Yes, it costs more, but its fast processor runs your games smoothly." 3, SHARE CONCERNS: The customer: "Hmm… I'm not so sure if I should get this." The staff member: "What worries you most about switching to a new phone?" 4, CORRECT MISCONCEPTION: The customer: "So the warranty covers everything, right?" The staff member, holding a warranty card: "Good question! The warranty covers manufacturing defects. Accidental damage, such as dropping the phone, isn't covered."</w:t>
       </w:r>
     </w:p>
     <w:p>
@@ -24439,7 +25368,7 @@
           <w:sz w:val="20"/>
           <w:szCs w:val="20"/>
         </w:rPr>
-        <w:t xml:space="preserve">C07: Three-panel comic at a Nexora store. 1, SIGNS OF A POSITIVE EXPERIENCE: The smiling customer holds her new phone and points at phone cases: "This is exactly the phone I was looking for! Do you have a case for it?" The staff member: "Yes, this case fits it perfectly." 2, AFTER A SALE: He hands her a Nexora bag: "Thank you, I'm sure the product will meet your needs. It has been a pleasure serving you." 3, IF THE CUSTOMER DOES NOT BUY: A different customer: "I'd like to think about it first." The staff member: "Certainly, thank you for your interest. Do come back if you decide to buy it another day."</w:t>
+        <w:t xml:space="preserve">C07 (v2, clearer "BUY" in the panel 3 caption): Three-panel comic at a Nexora store. 1, SIGNS OF A POSITIVE EXPERIENCE: The smiling customer holds her new phone and points at phone cases: "This is exactly the phone I was looking for! Do you have a case for it?" The staff member: "Yes, this case fits it perfectly." 2, AFTER A SALE: He hands her a Nexora bag: "Thank you, I'm sure the product will meet your needs. It has been a pleasure serving you." 3, IF THE CUSTOMER DOES NOT BUY: A different customer: "I'd like to think about it first." The staff member: "Certainly, thank you for your interest. Do come back if you decide to buy it another day."</w:t>
       </w:r>
     </w:p>
     <w:p>
@@ -24586,6 +25515,42 @@
     </w:p>
     <w:p>
       <w:pPr>
+        <w:pStyle w:val="ListParagraph"/>
+        <w:numPr>
+          <w:ilvl w:val="0"/>
+          <w:numId w:val="2"/>
+        </w:numPr>
+        <w:spacing w:after="60"/>
+      </w:pPr>
+      <w:r>
+        <w:rPr>
+          <w:color w:val="1F2937"/>
+          <w:sz w:val="20"/>
+          <w:szCs w:val="20"/>
+        </w:rPr>
+        <w:t xml:space="preserve">Three simulations on 29 October (a struggling reader, an average student and a fast student on a Chromebook and an iPad) completed all 7 levels with every lock, hint and badge working. Found: the share-link step was hard to follow; minimum answer lengths differed between levels and said "characters"; self-check prompts read like wrong answers; one Look at these again line pointed to the wrong level; and missing-item pop-ups behaved differently in Levels 5 and 6. All five are fixed in 0.12.0.</w:t>
+      </w:r>
+    </w:p>
+    <w:p>
+      <w:pPr>
+        <w:pStyle w:val="ListParagraph"/>
+        <w:numPr>
+          <w:ilvl w:val="0"/>
+          <w:numId w:val="2"/>
+        </w:numPr>
+        <w:spacing w:after="60"/>
+      </w:pPr>
+      <w:r>
+        <w:rPr>
+          <w:color w:val="1F2937"/>
+          <w:sz w:val="20"/>
+          <w:szCs w:val="20"/>
+        </w:rPr>
+        <w:t xml:space="preserve">Decided on 29 October: the link check stays as it is. Next opens once the box is ticked and the link box contains the word "gemini" (any capitals). The group knows that typing only "gemini" lets a student skip a chatbot; the teacher can spot this in the saved link.</w:t>
+      </w:r>
+    </w:p>
+    <w:p>
+      <w:pPr>
         <w:pStyle w:val="Heading3"/>
         <w:spacing w:after="100" w:before="200"/>
       </w:pPr>
@@ -24608,7 +25573,25 @@
           <w:sz w:val="20"/>
           <w:szCs w:val="20"/>
         </w:rPr>
-        <w:t xml:space="preserve">Clear test data (for example TEST1 rows) from the Google Sheet before classes log in.</w:t>
+        <w:t xml:space="preserve">Clear test data (for example TEST1 rows, including CLAUDESIMULATION1 to 3) from the Google Sheet and switch the registration class to the real class before classes log in.</w:t>
+      </w:r>
+    </w:p>
+    <w:p>
+      <w:pPr>
+        <w:pStyle w:val="ListParagraph"/>
+        <w:numPr>
+          <w:ilvl w:val="0"/>
+          <w:numId w:val="2"/>
+        </w:numPr>
+        <w:spacing w:after="60"/>
+      </w:pPr>
+      <w:r>
+        <w:rPr>
+          <w:color w:val="1F2937"/>
+          <w:sz w:val="20"/>
+          <w:szCs w:val="20"/>
+        </w:rPr>
+        <w:t xml:space="preserve">⚑ Check the Gemini button names in the share-link steps on a Chromebook and an iPad.</w:t>
       </w:r>
     </w:p>
     <w:p>
@@ -25067,6 +26050,118 @@
                 <w:szCs w:val="19"/>
               </w:rPr>
               <w:t xml:space="preserve">The notes split into Level 2, Learn: Customer Service (Part 1), with Stages 1 and 2 (13 cards), and Level 3, Learn: Customer Service (Part 2), with Stages 3 and 4 (7 cards). Three Nexora comics added (C05 to C07). The 8 steps show all at once, and the 8-steps video moves to its own card. New Level 6, Win Suzzie Back (an angry Suzzie chatbot for service recovery practice, badge Service Superstar). Chat with Alex, Serve Suzzie and the Check and Exit Ticket become Levels 4, 5 and 7. 7 levels.</w:t>
+            </w:r>
+          </w:p>
+        </w:tc>
+      </w:tr>
+      <w:tr>
+        <w:tc>
+          <w:tcPr>
+            <w:tcW w:type="dxa" w:w="2178"/>
+            <w:tcBorders>
+              <w:top w:val="single" w:color="E8DADF" w:sz="4"/>
+              <w:left w:val="single" w:color="E8DADF" w:sz="4"/>
+              <w:bottom w:val="single" w:color="E8DADF" w:sz="4"/>
+              <w:right w:val="single" w:color="E8DADF" w:sz="4"/>
+            </w:tcBorders>
+            <w:tcMar>
+              <w:top w:type="dxa" w:w="80"/>
+              <w:left w:type="dxa" w:w="120"/>
+              <w:bottom w:type="dxa" w:w="80"/>
+              <w:right w:type="dxa" w:w="120"/>
+            </w:tcMar>
+          </w:tcPr>
+          <w:p>
+            <w:r>
+              <w:rPr>
+                <w:color w:val="1F2937"/>
+                <w:sz w:val="19"/>
+                <w:szCs w:val="19"/>
+              </w:rPr>
+              <w:t xml:space="preserve">28 Oct (0.11.1 to 0.11.9)</w:t>
+            </w:r>
+          </w:p>
+        </w:tc>
+        <w:tc>
+          <w:tcPr>
+            <w:tcW w:type="dxa" w:w="7722"/>
+            <w:tcBorders>
+              <w:top w:val="single" w:color="E8DADF" w:sz="4"/>
+              <w:left w:val="single" w:color="E8DADF" w:sz="4"/>
+              <w:bottom w:val="single" w:color="E8DADF" w:sz="4"/>
+              <w:right w:val="single" w:color="E8DADF" w:sz="4"/>
+            </w:tcBorders>
+            <w:tcMar>
+              <w:top w:type="dxa" w:w="80"/>
+              <w:left w:type="dxa" w:w="120"/>
+              <w:bottom w:type="dxa" w:w="80"/>
+              <w:right w:type="dxa" w:w="120"/>
+            </w:tcMar>
+          </w:tcPr>
+          <w:p>
+            <w:r>
+              <w:rPr>
+                <w:color w:val="1F2937"/>
+                <w:sz w:val="19"/>
+                <w:szCs w:val="19"/>
+              </w:rPr>
+              <w:t xml:space="preserve">By the group: Service Saver badge; orange key words (#A84B08); the product-knowledge benefits sentence moved into a definition box; stage banners for Stages 1 to 4 replace the stage labels; approach quick-check instruction "Select the most appropriate approach for each question."; duplicate panel 1 bubble removed from C06 (v2); purple customer and blue staff boxes in the objection quick check; duplicate Stage 3 heading removed; clearer "BUY" in C07 (v2); 16px between definition boxes; ONE underlined in the Uniqlo question; illustrated icons and one header style for every level; Level 6 button "Open chat with angry Suzzie" and its greeting line removed; teacher preview laid out like the student pages.</w:t>
+            </w:r>
+          </w:p>
+        </w:tc>
+      </w:tr>
+      <w:tr>
+        <w:tc>
+          <w:tcPr>
+            <w:tcW w:type="dxa" w:w="2178"/>
+            <w:tcBorders>
+              <w:top w:val="single" w:color="E8DADF" w:sz="4"/>
+              <w:left w:val="single" w:color="E8DADF" w:sz="4"/>
+              <w:bottom w:val="single" w:color="E8DADF" w:sz="4"/>
+              <w:right w:val="single" w:color="E8DADF" w:sz="4"/>
+            </w:tcBorders>
+            <w:tcMar>
+              <w:top w:type="dxa" w:w="80"/>
+              <w:left w:type="dxa" w:w="120"/>
+              <w:bottom w:type="dxa" w:w="80"/>
+              <w:right w:type="dxa" w:w="120"/>
+            </w:tcMar>
+          </w:tcPr>
+          <w:p>
+            <w:r>
+              <w:rPr>
+                <w:color w:val="1F2937"/>
+                <w:sz w:val="19"/>
+                <w:szCs w:val="19"/>
+              </w:rPr>
+              <w:t xml:space="preserve">29 Oct (🆕 0.12.0, after three student simulations)</w:t>
+            </w:r>
+          </w:p>
+        </w:tc>
+        <w:tc>
+          <w:tcPr>
+            <w:tcW w:type="dxa" w:w="7722"/>
+            <w:tcBorders>
+              <w:top w:val="single" w:color="E8DADF" w:sz="4"/>
+              <w:left w:val="single" w:color="E8DADF" w:sz="4"/>
+              <w:bottom w:val="single" w:color="E8DADF" w:sz="4"/>
+              <w:right w:val="single" w:color="E8DADF" w:sz="4"/>
+            </w:tcBorders>
+            <w:tcMar>
+              <w:top w:type="dxa" w:w="80"/>
+              <w:left w:type="dxa" w:w="120"/>
+              <w:bottom w:type="dxa" w:w="80"/>
+              <w:right w:type="dxa" w:w="120"/>
+            </w:tcMar>
+          </w:tcPr>
+          <w:p>
+            <w:r>
+              <w:rPr>
+                <w:color w:val="1F2937"/>
+                <w:sz w:val="19"/>
+                <w:szCs w:val="19"/>
+              </w:rPr>
+              <w:t xml:space="preserve">1) Three numbered steps on how to get the Gemini chat link in Levels 4, 5 and 6. 2) One rule for typed answers (at least 20 characters, worded as "at least one full sentence"), with one-word and link boxes exempt. 3) Self-check prompts start "Self-check:" and use a neutral style with no ✓ or ✗. 4) The Level 4 Q2 pointers for lines Q, R and S go to the card where each stage is taught (Level 2, Stage 2; Level 3, Stage 3; Level 2, Stage 1). Work already submitted before 0.12.0 is not re-checked against the new answer-length rule; it applies the next time a student submits. 5) Not finished yet pop-ups list everything at once with Q labels that match the screen (Levels 1, 5 and 6 questions now labelled Q1 to Q3).</w:t>
             </w:r>
           </w:p>
         </w:tc>
@@ -25193,7 +26288,7 @@
         <w:sz w:val="16"/>
         <w:szCs w:val="16"/>
       </w:rPr>
-      <w:t xml:space="preserve">EBS Chapter 6 storyboard, version 0.11.0 · page </w:t>
+      <w:t xml:space="preserve">EBS Chapter 6 storyboard, version 0.12.0 · page </w:t>
     </w:r>
     <w:r>
       <w:rPr>

</xml_diff>